<commit_message>
feat: Add Czech declension system for PP protocols and extend LSZ mappings
- Implement Czech noun gender detection and adjective declension
- Add _detect_czech_noun_gender() for grammatical gender analysis
- Add _decline_czech_adjective() for proper adjective agreement
- Extend LSZ field mappings with company and measurement info (rows 3-8)
- Update pp_problematicke_polohy_seznam with grammatically correct output
- Update sample protocols with latest templates
- Minor GUI improvements in wizard and dialogs

🤖 Generated with [Claude Code](https://claude.com/claude-code)

Co-Authored-By: Claude <noreply@anthropic.com>
</commit_message>
<xml_diff>
--- a/sample_protocols/Autorizované protokoly pro MUŽE/LSZ_XX_Firma_Pozice_placeholdery.docx
+++ b/sample_protocols/Autorizované protokoly pro MUŽE/LSZ_XX_Firma_Pozice_placeholdery.docx
@@ -69,6 +69,9 @@
         <w:ind w:left="2977"/>
       </w:pPr>
       <w:r>
+        <w:rPr>
+          <w:noProof/>
+        </w:rPr>
         <w:drawing>
           <wp:inline distT="0" distB="0" distL="0" distR="0" wp14:anchorId="2758E18A" wp14:editId="17D1389D">
             <wp:extent cx="2096679" cy="1019175"/>
@@ -145,35 +148,7 @@
         <w:rPr>
           <w:highlight w:val="magenta"/>
         </w:rPr>
-        <w:t xml:space="preserve">{{MĚSÍC/ROK ve formátu XX/XXXX </w:t>
-      </w:r>
-      <w:proofErr w:type="gramStart"/>
-      <w:r>
-        <w:rPr>
-          <w:highlight w:val="magenta"/>
-        </w:rPr>
-        <w:t>z</w:t>
-      </w:r>
-      <w:proofErr w:type="gramEnd"/>
-      <w:r>
-        <w:rPr>
-          <w:highlight w:val="magenta"/>
-        </w:rPr>
-        <w:t> section2_</w:t>
-      </w:r>
-      <w:proofErr w:type="gramStart"/>
-      <w:r>
-        <w:rPr>
-          <w:highlight w:val="magenta"/>
-        </w:rPr>
-        <w:t>firma.measurement</w:t>
-      </w:r>
-      <w:proofErr w:type="gramEnd"/>
-      <w:r>
-        <w:rPr>
-          <w:highlight w:val="magenta"/>
-        </w:rPr>
-        <w:t>_date}}</w:t>
+        <w:t>{{MĚSÍC/ROK ve formátu XX/XXXX z section2_firma.measurement_date}}</w:t>
       </w:r>
     </w:p>
     <w:p/>
@@ -194,21 +169,7 @@
         <w:rPr>
           <w:highlight w:val="magenta"/>
         </w:rPr>
-        <w:t>{{section2_</w:t>
-      </w:r>
-      <w:proofErr w:type="gramStart"/>
-      <w:r>
-        <w:rPr>
-          <w:highlight w:val="magenta"/>
-        </w:rPr>
-        <w:t>firma.company</w:t>
-      </w:r>
-      <w:proofErr w:type="gramEnd"/>
-      <w:r>
-        <w:rPr>
-          <w:highlight w:val="magenta"/>
-        </w:rPr>
-        <w:t>}}</w:t>
+        <w:t>{{section2_firma.company}}</w:t>
       </w:r>
     </w:p>
     <w:p>
@@ -222,102 +183,18 @@
         <w:rPr>
           <w:highlight w:val="magenta"/>
         </w:rPr>
-        <w:t>{{section2_</w:t>
-      </w:r>
-      <w:proofErr w:type="gramStart"/>
+        <w:t>{{section2_firma.address a section2_firma.conscription_number – tato data je potřeba přidat do gui a jsonu}}</w:t>
+      </w:r>
+    </w:p>
+    <w:p>
+      <w:pPr>
+        <w:ind w:left="3540"/>
+      </w:pPr>
       <w:r>
         <w:rPr>
           <w:highlight w:val="magenta"/>
         </w:rPr>
-        <w:t>firma.address</w:t>
-      </w:r>
-      <w:proofErr w:type="gramEnd"/>
-      <w:r>
-        <w:rPr>
-          <w:highlight w:val="magenta"/>
-        </w:rPr>
-        <w:t xml:space="preserve"> a section2_</w:t>
-      </w:r>
-      <w:proofErr w:type="gramStart"/>
-      <w:r>
-        <w:rPr>
-          <w:highlight w:val="magenta"/>
-        </w:rPr>
-        <w:t>firma.conscription</w:t>
-      </w:r>
-      <w:proofErr w:type="gramEnd"/>
-      <w:r>
-        <w:rPr>
-          <w:highlight w:val="magenta"/>
-        </w:rPr>
-        <w:t xml:space="preserve">_number – tato data je potřeba přidat do </w:t>
-      </w:r>
-      <w:proofErr w:type="spellStart"/>
-      <w:r>
-        <w:rPr>
-          <w:highlight w:val="magenta"/>
-        </w:rPr>
-        <w:t>gui</w:t>
-      </w:r>
-      <w:proofErr w:type="spellEnd"/>
-      <w:r>
-        <w:rPr>
-          <w:highlight w:val="magenta"/>
-        </w:rPr>
-        <w:t xml:space="preserve"> a </w:t>
-      </w:r>
-      <w:proofErr w:type="spellStart"/>
-      <w:r>
-        <w:rPr>
-          <w:highlight w:val="magenta"/>
-        </w:rPr>
-        <w:t>jsonu</w:t>
-      </w:r>
-      <w:proofErr w:type="spellEnd"/>
-      <w:r>
-        <w:rPr>
-          <w:highlight w:val="magenta"/>
-        </w:rPr>
-        <w:t>}}</w:t>
-      </w:r>
-    </w:p>
-    <w:p>
-      <w:pPr>
-        <w:ind w:left="3540"/>
-      </w:pPr>
-      <w:r>
-        <w:rPr>
-          <w:highlight w:val="magenta"/>
-        </w:rPr>
-        <w:t>{{section2_</w:t>
-      </w:r>
-      <w:proofErr w:type="gramStart"/>
-      <w:r>
-        <w:rPr>
-          <w:highlight w:val="magenta"/>
-        </w:rPr>
-        <w:t>firma.zipcode</w:t>
-      </w:r>
-      <w:proofErr w:type="gramEnd"/>
-      <w:r>
-        <w:rPr>
-          <w:highlight w:val="magenta"/>
-        </w:rPr>
-        <w:t xml:space="preserve"> a section2_</w:t>
-      </w:r>
-      <w:proofErr w:type="gramStart"/>
-      <w:r>
-        <w:rPr>
-          <w:highlight w:val="magenta"/>
-        </w:rPr>
-        <w:t>firma.city</w:t>
-      </w:r>
-      <w:proofErr w:type="gramEnd"/>
-      <w:r>
-        <w:rPr>
-          <w:highlight w:val="magenta"/>
-        </w:rPr>
-        <w:t xml:space="preserve"> a section2_firma.part_of_the_city}}</w:t>
+        <w:t>{{section2_firma.zipcode a section2_firma.city a section2_firma.part_of_the_city}}</w:t>
       </w:r>
     </w:p>
     <w:p>
@@ -363,52 +240,27 @@
         <w:rPr>
           <w:highlight w:val="magenta"/>
         </w:rPr>
-        <w:t>{{section2_</w:t>
-      </w:r>
-      <w:proofErr w:type="gramStart"/>
+        <w:t>{{section2_firma.profession_name}}</w:t>
+      </w:r>
+      <w:r>
+        <w:t xml:space="preserve"> - muži</w:t>
+      </w:r>
+    </w:p>
+    <w:p>
+      <w:r>
+        <w:t>Pracoviště:</w:t>
+      </w:r>
+      <w:r>
+        <w:tab/>
+      </w:r>
+      <w:r>
+        <w:tab/>
+      </w:r>
       <w:r>
         <w:rPr>
           <w:highlight w:val="magenta"/>
         </w:rPr>
-        <w:t>firma.profession</w:t>
-      </w:r>
-      <w:proofErr w:type="gramEnd"/>
-      <w:r>
-        <w:rPr>
-          <w:highlight w:val="magenta"/>
-        </w:rPr>
-        <w:t>_name}}</w:t>
-      </w:r>
-    </w:p>
-    <w:p>
-      <w:r>
-        <w:t>Pracoviště:</w:t>
-      </w:r>
-      <w:r>
-        <w:tab/>
-      </w:r>
-      <w:r>
-        <w:tab/>
-      </w:r>
-      <w:r>
-        <w:rPr>
-          <w:highlight w:val="magenta"/>
-        </w:rPr>
-        <w:t>{{section2_</w:t>
-      </w:r>
-      <w:proofErr w:type="gramStart"/>
-      <w:r>
-        <w:rPr>
-          <w:highlight w:val="magenta"/>
-        </w:rPr>
-        <w:t>firma.workplace</w:t>
-      </w:r>
-      <w:proofErr w:type="gramEnd"/>
-      <w:r>
-        <w:rPr>
-          <w:highlight w:val="magenta"/>
-        </w:rPr>
-        <w:t>}}</w:t>
+        <w:t>{{section2_firma.workplace}}</w:t>
       </w:r>
     </w:p>
     <w:p>
@@ -539,31 +391,7 @@
         <w:jc w:val="both"/>
       </w:pPr>
       <w:r>
-        <w:t xml:space="preserve">Měření lokální svalové zátěže bylo provedeno metodou integrované elektromyografie přístrojem EMG </w:t>
-      </w:r>
-      <w:proofErr w:type="spellStart"/>
-      <w:r>
-        <w:t>Holter</w:t>
-      </w:r>
-      <w:proofErr w:type="spellEnd"/>
-      <w:r>
-        <w:t xml:space="preserve">. Integrace je matematický proces, který vypočítává plochu opsanou křivkou. Pro integraci EMG signálu je použit </w:t>
-      </w:r>
-      <w:proofErr w:type="spellStart"/>
-      <w:r>
-        <w:t>celovlnný</w:t>
-      </w:r>
-      <w:proofErr w:type="spellEnd"/>
-      <w:r>
-        <w:t xml:space="preserve"> usměrňovač a elektrický integrátor. Integrovaný elektromyogram představuje celkovou svalovou aktivitu a je funkcí amplitudy, trvání a frekvence v průběhu jednotlivých EMG potenciálů. EMG potenciály jsou snímány speciálními povrchovými elektrodami. Snímaný signál je zesílen diferenciálním zesilovačem, filtrován, </w:t>
-      </w:r>
-      <w:proofErr w:type="spellStart"/>
-      <w:r>
-        <w:t>celovlnně</w:t>
-      </w:r>
-      <w:proofErr w:type="spellEnd"/>
-      <w:r>
-        <w:t xml:space="preserve"> usměrňován, integrován, digitalizován a průběžně ukládán do paměti, EMG signály jsou vzorkovány 20x za sekundu. Následně je vypočtena jejich průměrná hodnota, která je ukládána do paměti přístroje. </w:t>
+        <w:t xml:space="preserve">Měření lokální svalové zátěže bylo provedeno metodou integrované elektromyografie přístrojem EMG Holter. Integrace je matematický proces, který vypočítává plochu opsanou křivkou. Pro integraci EMG signálu je použit celovlnný usměrňovač a elektrický integrátor. Integrovaný elektromyogram představuje celkovou svalovou aktivitu a je funkcí amplitudy, trvání a frekvence v průběhu jednotlivých EMG potenciálů. EMG potenciály jsou snímány speciálními povrchovými elektrodami. Snímaný signál je zesílen diferenciálním zesilovačem, filtrován, celovlnně usměrňován, integrován, digitalizován a průběžně ukládán do paměti, EMG signály jsou vzorkovány 20x za sekundu. Následně je vypočtena jejich průměrná hodnota, která je ukládána do paměti přístroje. </w:t>
       </w:r>
     </w:p>
     <w:p>
@@ -573,23 +401,7 @@
         <w:jc w:val="both"/>
       </w:pPr>
       <w:r>
-        <w:t xml:space="preserve">Pomocí programu je pak vypočtena časově vážená průměrná celosměnová hodnota vynakládané svalové síly, vyjádřená v procentech z maxima (referenční hodnoty) – při výpočtu je odečten posun křivky od nulové linie. Tyto hodnoty jsou rovněž vypočteny pro jednotlivé pracovní operace. V případě bezpečnostních přestávek, technologických prostojů apod., činí použitá hodnota pro všechny měřené svalové skupiny 3,00 % </w:t>
-      </w:r>
-      <w:proofErr w:type="spellStart"/>
-      <w:r>
-        <w:t>Fmax</w:t>
-      </w:r>
-      <w:proofErr w:type="spellEnd"/>
-      <w:r>
-        <w:t xml:space="preserve">. U činností jako jsou příprava a úklid pracoviště, jsou pro časové vážení užity hodnoty 5,00–8,00 % </w:t>
-      </w:r>
-      <w:proofErr w:type="spellStart"/>
-      <w:r>
-        <w:t>Fmax</w:t>
-      </w:r>
-      <w:proofErr w:type="spellEnd"/>
-      <w:r>
-        <w:t xml:space="preserve"> pro všechny měřené svalové skupiny (pokud tyto činnosti nebyly měřeny). Hodnoceny byly změny EMG potenciálů flexorů a extenzorů rukou a předloktí obou horních končetin (EMG 1 – svalové skupiny extenzorů pravé ruky a předloktí, EMG 2 – svalové skupiny flexorů pravé ruky a předloktí, EMG 3 – svalové skupiny extenzorů levé ruky a předloktí, EMG 4 – svalové skupiny flexorů levé ruky a předloktí). Četnost pracovních pohybů byla kalkulována na základě videozáznamu měřených pracovních činností v kombinaci s přímým odečtem při měření na pracovišti. </w:t>
+        <w:t xml:space="preserve">Pomocí programu je pak vypočtena časově vážená průměrná celosměnová hodnota vynakládané svalové síly, vyjádřená v procentech z maxima (referenční hodnoty) – při výpočtu je odečten posun křivky od nulové linie. Tyto hodnoty jsou rovněž vypočteny pro jednotlivé pracovní operace. V případě bezpečnostních přestávek, technologických prostojů apod., činí použitá hodnota pro všechny měřené svalové skupiny 3,00 % Fmax. U činností jako jsou příprava a úklid pracoviště, jsou pro časové vážení užity hodnoty 5,00–8,00 % Fmax pro všechny měřené svalové skupiny (pokud tyto činnosti nebyly měřeny). Hodnoceny byly změny EMG potenciálů flexorů a extenzorů rukou a předloktí obou horních končetin (EMG 1 – svalové skupiny extenzorů pravé ruky a předloktí, EMG 2 – svalové skupiny flexorů pravé ruky a předloktí, EMG 3 – svalové skupiny extenzorů levé ruky a předloktí, EMG 4 – svalové skupiny flexorů levé ruky a předloktí). Četnost pracovních pohybů byla kalkulována na základě videozáznamu měřených pracovních činností v kombinaci s přímým odečtem při měření na pracovišti. </w:t>
       </w:r>
     </w:p>
     <w:p>
@@ -624,59 +436,16 @@
         <w:t>ěření odpovídal požadavkům dle n</w:t>
       </w:r>
       <w:r>
-        <w:t xml:space="preserve">ařízení vlády č. 361/2007 Sb., v platném </w:t>
-      </w:r>
-      <w:proofErr w:type="gramStart"/>
-      <w:r>
-        <w:t>znění.</w:t>
-      </w:r>
-      <w:r>
-        <w:t>{</w:t>
-      </w:r>
-      <w:proofErr w:type="gramEnd"/>
-      <w:r>
-        <w:t>{</w:t>
+        <w:t>ařízení vlády č. 361/2007 Sb., v platném znění.</w:t>
+      </w:r>
+      <w:r>
+        <w:t>{{</w:t>
       </w:r>
       <w:r>
         <w:rPr>
           <w:highlight w:val="yellow"/>
         </w:rPr>
-        <w:t xml:space="preserve">Do GUI přidáme možnost počet pracovníků a pohlaví muž/žena a počet dní, jak dlouho probíhalo měření a </w:t>
-      </w:r>
-      <w:proofErr w:type="spellStart"/>
-      <w:r>
-        <w:rPr>
-          <w:highlight w:val="yellow"/>
-        </w:rPr>
-        <w:t>template</w:t>
-      </w:r>
-      <w:proofErr w:type="spellEnd"/>
-      <w:r>
-        <w:rPr>
-          <w:highlight w:val="yellow"/>
-        </w:rPr>
-        <w:t xml:space="preserve"> bude následující, podle toho, co uživatel vybere: „Měření probíhalo v *jednom dni, v jedné průměrné směně NEBO dvou dnech ve dvou průměrných </w:t>
-      </w:r>
-      <w:proofErr w:type="gramStart"/>
-      <w:r>
-        <w:rPr>
-          <w:highlight w:val="yellow"/>
-        </w:rPr>
-        <w:t>směnách.*</w:t>
-      </w:r>
-      <w:proofErr w:type="gramEnd"/>
-      <w:r>
-        <w:rPr>
-          <w:highlight w:val="yellow"/>
-        </w:rPr>
-        <w:t xml:space="preserve"> POTÉ DALŠÍ VĚTA *Měřeni byli ½ pracovníci/pracovnice – muž/muži, žena/</w:t>
-      </w:r>
-      <w:proofErr w:type="gramStart"/>
-      <w:r>
-        <w:rPr>
-          <w:highlight w:val="yellow"/>
-        </w:rPr>
-        <w:t>ženy.</w:t>
+        <w:t>Do GUI přidáme možnost počet pracovníků a pohlaví muž/žena a počet dní, jak dlouho probíhalo měření a template bude následující, podle toho, co uživatel vybere: „Měření probíhalo v *jednom dni, v jedné průměrné směně NEBO dvou dnech ve dvou průměrných směnách.* POTÉ DALŠÍ VĚTA *Měřeni byli ½ pracovníci/pracovnice – muž/muži, žena/ženy.</w:t>
       </w:r>
       <w:r>
         <w:rPr>
@@ -684,7 +453,6 @@
         </w:rPr>
         <w:t>*</w:t>
       </w:r>
-      <w:proofErr w:type="gramEnd"/>
       <w:r>
         <w:rPr>
           <w:highlight w:val="yellow"/>
@@ -708,149 +476,7 @@
         <w:rPr>
           <w:highlight w:val="yellow"/>
         </w:rPr>
-        <w:t>{{Níže máš k dispozici tabulku s </w:t>
-      </w:r>
-      <w:proofErr w:type="spellStart"/>
-      <w:r>
-        <w:rPr>
-          <w:highlight w:val="yellow"/>
-        </w:rPr>
-        <w:t>holtrama</w:t>
-      </w:r>
-      <w:proofErr w:type="spellEnd"/>
-      <w:r>
-        <w:rPr>
-          <w:highlight w:val="yellow"/>
-        </w:rPr>
-        <w:t>. Tato tabulka je také částečně v </w:t>
-      </w:r>
-      <w:proofErr w:type="spellStart"/>
-      <w:r>
-        <w:rPr>
-          <w:highlight w:val="yellow"/>
-        </w:rPr>
-        <w:t>lsz</w:t>
-      </w:r>
-      <w:proofErr w:type="spellEnd"/>
-      <w:r>
-        <w:rPr>
-          <w:highlight w:val="yellow"/>
-        </w:rPr>
-        <w:t xml:space="preserve"> excelu. </w:t>
-      </w:r>
-      <w:proofErr w:type="spellStart"/>
-      <w:r>
-        <w:rPr>
-          <w:highlight w:val="yellow"/>
-        </w:rPr>
-        <w:t>Lsz</w:t>
-      </w:r>
-      <w:proofErr w:type="spellEnd"/>
-      <w:r>
-        <w:rPr>
-          <w:highlight w:val="yellow"/>
-        </w:rPr>
-        <w:t xml:space="preserve"> excel obsahuje: P12-P17 Označení </w:t>
-      </w:r>
-      <w:proofErr w:type="spellStart"/>
-      <w:r>
-        <w:rPr>
-          <w:highlight w:val="yellow"/>
-        </w:rPr>
-        <w:t>holteru</w:t>
-      </w:r>
-      <w:proofErr w:type="spellEnd"/>
-      <w:r>
-        <w:rPr>
-          <w:highlight w:val="yellow"/>
-        </w:rPr>
-        <w:t xml:space="preserve"> (</w:t>
-      </w:r>
-      <w:proofErr w:type="spellStart"/>
-      <w:proofErr w:type="gramStart"/>
-      <w:r>
-        <w:rPr>
-          <w:highlight w:val="yellow"/>
-        </w:rPr>
-        <w:t>a,b</w:t>
-      </w:r>
-      <w:proofErr w:type="gramEnd"/>
-      <w:r>
-        <w:rPr>
-          <w:highlight w:val="yellow"/>
-        </w:rPr>
-        <w:t>,</w:t>
-      </w:r>
-      <w:proofErr w:type="gramStart"/>
-      <w:r>
-        <w:rPr>
-          <w:highlight w:val="yellow"/>
-        </w:rPr>
-        <w:t>c,d</w:t>
-      </w:r>
-      <w:proofErr w:type="gramEnd"/>
-      <w:r>
-        <w:rPr>
-          <w:highlight w:val="yellow"/>
-        </w:rPr>
-        <w:t>,</w:t>
-      </w:r>
-      <w:proofErr w:type="gramStart"/>
-      <w:r>
-        <w:rPr>
-          <w:highlight w:val="yellow"/>
-        </w:rPr>
-        <w:t>e,f</w:t>
-      </w:r>
-      <w:proofErr w:type="spellEnd"/>
-      <w:proofErr w:type="gramEnd"/>
-      <w:r>
-        <w:rPr>
-          <w:highlight w:val="yellow"/>
-        </w:rPr>
-        <w:t xml:space="preserve">), R12-R17 název </w:t>
-      </w:r>
-      <w:proofErr w:type="spellStart"/>
-      <w:r>
-        <w:rPr>
-          <w:highlight w:val="yellow"/>
-        </w:rPr>
-        <w:t>holteru</w:t>
-      </w:r>
-      <w:proofErr w:type="spellEnd"/>
-      <w:r>
-        <w:rPr>
-          <w:highlight w:val="yellow"/>
-        </w:rPr>
-        <w:t xml:space="preserve">, které korespondují s názvy v tabulce níže. Poté v buňce D22 je typ </w:t>
-      </w:r>
-      <w:proofErr w:type="spellStart"/>
-      <w:r>
-        <w:rPr>
-          <w:highlight w:val="yellow"/>
-        </w:rPr>
-        <w:t>holteru</w:t>
-      </w:r>
-      <w:proofErr w:type="spellEnd"/>
-      <w:r>
-        <w:rPr>
-          <w:highlight w:val="yellow"/>
-        </w:rPr>
-        <w:t xml:space="preserve"> například „E“. takže </w:t>
-      </w:r>
-      <w:proofErr w:type="spellStart"/>
-      <w:r>
-        <w:rPr>
-          <w:highlight w:val="yellow"/>
-        </w:rPr>
-        <w:t>napamuj</w:t>
-      </w:r>
-      <w:proofErr w:type="spellEnd"/>
-      <w:r>
-        <w:rPr>
-          <w:highlight w:val="yellow"/>
-        </w:rPr>
-        <w:t xml:space="preserve"> tu buňku na správnou hodnotu z excel tabulky, potom tu hodnotu z excel tabulky najdi níže v tabulce a vyznač ji tučně.}}</w:t>
+        <w:t>{{Níže máš k dispozici tabulku s holtrama. Tato tabulka je také částečně v lsz excelu. Lsz excel obsahuje: P12-P17 Označení holteru (a,b,c,d,e,f), R12-R17 název holteru, které korespondují s názvy v tabulce níže. Poté v buňce D22 je typ holteru například „E“. takže napamuj tu buňku na správnou hodnotu z excel tabulky, potom tu hodnotu z excel tabulky najdi níže v tabulce a vyznač ji tučně.}}</w:t>
       </w:r>
     </w:p>
     <w:tbl>
@@ -910,15 +536,7 @@
           </w:tcPr>
           <w:p>
             <w:r>
-              <w:t xml:space="preserve">EMG </w:t>
-            </w:r>
-            <w:proofErr w:type="spellStart"/>
-            <w:r>
-              <w:t>Holter</w:t>
-            </w:r>
-            <w:proofErr w:type="spellEnd"/>
-            <w:r>
-              <w:t xml:space="preserve"> č. 60/16 + příslušenství</w:t>
+              <w:t>EMG Holter č. 60/16 + příslušenství</w:t>
             </w:r>
           </w:p>
         </w:tc>
@@ -952,15 +570,7 @@
           </w:tcPr>
           <w:p>
             <w:r>
-              <w:t xml:space="preserve">EMG </w:t>
-            </w:r>
-            <w:proofErr w:type="spellStart"/>
-            <w:r>
-              <w:t>Holter</w:t>
-            </w:r>
-            <w:proofErr w:type="spellEnd"/>
-            <w:r>
-              <w:t xml:space="preserve"> č. 65/17 + příslušenství</w:t>
+              <w:t>EMG Holter č. 65/17 + příslušenství</w:t>
             </w:r>
           </w:p>
         </w:tc>
@@ -994,15 +604,7 @@
           </w:tcPr>
           <w:p>
             <w:r>
-              <w:t xml:space="preserve">EMG </w:t>
-            </w:r>
-            <w:proofErr w:type="spellStart"/>
-            <w:r>
-              <w:t>Holter</w:t>
-            </w:r>
-            <w:proofErr w:type="spellEnd"/>
-            <w:r>
-              <w:t xml:space="preserve"> č. 84/19 + příslušenství</w:t>
+              <w:t>EMG Holter č. 84/19 + příslušenství</w:t>
             </w:r>
           </w:p>
         </w:tc>
@@ -1036,15 +638,7 @@
           </w:tcPr>
           <w:p>
             <w:r>
-              <w:t xml:space="preserve">EMG </w:t>
-            </w:r>
-            <w:proofErr w:type="spellStart"/>
-            <w:r>
-              <w:t>Holter</w:t>
-            </w:r>
-            <w:proofErr w:type="spellEnd"/>
-            <w:r>
-              <w:t xml:space="preserve"> č. 85/19 + příslušenství</w:t>
+              <w:t>EMG Holter č. 85/19 + příslušenství</w:t>
             </w:r>
           </w:p>
         </w:tc>
@@ -1078,15 +672,7 @@
           </w:tcPr>
           <w:p>
             <w:r>
-              <w:t xml:space="preserve">EMG </w:t>
-            </w:r>
-            <w:proofErr w:type="spellStart"/>
-            <w:r>
-              <w:t>Holter</w:t>
-            </w:r>
-            <w:proofErr w:type="spellEnd"/>
-            <w:r>
-              <w:t xml:space="preserve"> č. 86/20 + příslušenství</w:t>
+              <w:t>EMG Holter č. 86/20 + příslušenství</w:t>
             </w:r>
           </w:p>
         </w:tc>
@@ -1120,15 +706,7 @@
           </w:tcPr>
           <w:p>
             <w:r>
-              <w:t xml:space="preserve">EMG </w:t>
-            </w:r>
-            <w:proofErr w:type="spellStart"/>
-            <w:r>
-              <w:t>Holter</w:t>
-            </w:r>
-            <w:proofErr w:type="spellEnd"/>
-            <w:r>
-              <w:t xml:space="preserve"> č. 87/20 + příslušenství</w:t>
+              <w:t>EMG Holter č. 87/20 + příslušenství</w:t>
             </w:r>
           </w:p>
         </w:tc>
@@ -1301,35 +879,7 @@
         <w:rPr>
           <w:highlight w:val="lightGray"/>
         </w:rPr>
-        <w:t xml:space="preserve">{{Celá tato sekce popis práce a pracoviště se nahrazuje </w:t>
-      </w:r>
-      <w:proofErr w:type="spellStart"/>
-      <w:r>
-        <w:rPr>
-          <w:highlight w:val="lightGray"/>
-        </w:rPr>
-        <w:t>word</w:t>
-      </w:r>
-      <w:proofErr w:type="spellEnd"/>
-      <w:r>
-        <w:rPr>
-          <w:highlight w:val="lightGray"/>
-        </w:rPr>
-        <w:t xml:space="preserve"> dokumentem, který uživatel nahraje. Je v něm i ta tabulka s časovým snímkem, tudíž zde se nebudou doplňovat jednotlivé </w:t>
-      </w:r>
-      <w:proofErr w:type="spellStart"/>
-      <w:r>
-        <w:rPr>
-          <w:highlight w:val="lightGray"/>
-        </w:rPr>
-        <w:t>placeholdery</w:t>
-      </w:r>
-      <w:proofErr w:type="spellEnd"/>
-      <w:r>
-        <w:rPr>
-          <w:highlight w:val="lightGray"/>
-        </w:rPr>
-        <w:t>, ale celý text se nahradí.}}</w:t>
+        <w:t>{{Celá tato sekce popis práce a pracoviště se nahrazuje word dokumentem, který uživatel nahraje. Je v něm i ta tabulka s časovým snímkem, tudíž zde se nebudou doplňovat jednotlivé placeholdery, ale celý text se nahradí.}}</w:t>
       </w:r>
     </w:p>
     <w:tbl>
@@ -1854,21 +1404,7 @@
               <w:rPr>
                 <w:highlight w:val="lightGray"/>
               </w:rPr>
-              <w:t xml:space="preserve">Snížení/Navýšení </w:t>
-            </w:r>
-            <w:proofErr w:type="spellStart"/>
-            <w:r>
-              <w:rPr>
-                <w:highlight w:val="lightGray"/>
-              </w:rPr>
-              <w:t>hyg</w:t>
-            </w:r>
-            <w:proofErr w:type="spellEnd"/>
-            <w:r>
-              <w:rPr>
-                <w:highlight w:val="lightGray"/>
-              </w:rPr>
-              <w:t xml:space="preserve">. </w:t>
+              <w:t xml:space="preserve">Snížení/Navýšení hyg. </w:t>
             </w:r>
           </w:p>
           <w:p>
@@ -2001,6 +1537,7 @@
       </w:pPr>
       <w:r>
         <w:rPr>
+          <w:noProof/>
           <w:highlight w:val="lightGray"/>
         </w:rPr>
         <w:lastRenderedPageBreak/>
@@ -2087,49 +1624,7 @@
         <w:rPr>
           <w:highlight w:val="lightGray"/>
         </w:rPr>
-        <w:t xml:space="preserve">V den měření (tj. 20. 02. 2024 a 21. 02. 2024) zaměstnanci zhotovovali výrobek pod evidenčním číslem 10076145 (611 D). Na začátku pracovního cyklu zaměstnanec odebere oběma horníma končetinami (HK) ze stolku (předpřipraví jiný zaměstnanec) nebo ze stroje zavařený box a vloží ho do stroje </w:t>
-      </w:r>
-      <w:proofErr w:type="spellStart"/>
-      <w:r>
-        <w:rPr>
-          <w:highlight w:val="lightGray"/>
-        </w:rPr>
-        <w:t>superfréza</w:t>
-      </w:r>
-      <w:proofErr w:type="spellEnd"/>
-      <w:r>
-        <w:rPr>
-          <w:highlight w:val="lightGray"/>
-        </w:rPr>
-        <w:t xml:space="preserve">, pravou horní končetinou (PHK) zmáčkne tlačítko start. Obroušený díl poté odebere oběma HK a přejde s ním ke kalibraci. Zde zkalibruje vstupy i výstupy, box odebere oběma HK, vloží do </w:t>
-      </w:r>
-      <w:proofErr w:type="spellStart"/>
-      <w:r>
-        <w:rPr>
-          <w:highlight w:val="lightGray"/>
-        </w:rPr>
-        <w:t>leaktesteru</w:t>
-      </w:r>
-      <w:proofErr w:type="spellEnd"/>
-      <w:r>
-        <w:rPr>
-          <w:highlight w:val="lightGray"/>
-        </w:rPr>
-        <w:t xml:space="preserve"> a stisknutím tlačítek levou horní končetinou (LHK) a PHK zmáčkne start. Nakonec vyjme díl s </w:t>
-      </w:r>
-      <w:proofErr w:type="spellStart"/>
-      <w:r>
-        <w:rPr>
-          <w:highlight w:val="lightGray"/>
-        </w:rPr>
-        <w:t>leaktesteru</w:t>
-      </w:r>
-      <w:proofErr w:type="spellEnd"/>
-      <w:r>
-        <w:rPr>
-          <w:highlight w:val="lightGray"/>
-        </w:rPr>
-        <w:t>, vizuálně zkontroluje a odloží jej do bedny. Takto pokračuje u všech dalších boxů, pracovní proces se opakuje, v průběhu cyk</w:t>
+        <w:t>V den měření (tj. 20. 02. 2024 a 21. 02. 2024) zaměstnanci zhotovovali výrobek pod evidenčním číslem 10076145 (611 D). Na začátku pracovního cyklu zaměstnanec odebere oběma horníma končetinami (HK) ze stolku (předpřipraví jiný zaměstnanec) nebo ze stroje zavařený box a vloží ho do stroje superfréza, pravou horní končetinou (PHK) zmáčkne tlačítko start. Obroušený díl poté odebere oběma HK a přejde s ním ke kalibraci. Zde zkalibruje vstupy i výstupy, box odebere oběma HK, vloží do leaktesteru a stisknutím tlačítek levou horní končetinou (LHK) a PHK zmáčkne start. Nakonec vyjme díl s leaktesteru, vizuálně zkontroluje a odloží jej do bedny. Takto pokračuje u všech dalších boxů, pracovní proces se opakuje, v průběhu cyk</w:t>
       </w:r>
       <w:r>
         <w:rPr>
@@ -2177,6 +1672,7 @@
       </w:pPr>
       <w:r>
         <w:rPr>
+          <w:noProof/>
           <w:highlight w:val="lightGray"/>
         </w:rPr>
         <w:drawing>
@@ -2230,6 +1726,7 @@
       </w:r>
       <w:r>
         <w:rPr>
+          <w:noProof/>
           <w:highlight w:val="lightGray"/>
         </w:rPr>
         <w:drawing>
@@ -2276,6 +1773,7 @@
       </w:r>
       <w:r>
         <w:rPr>
+          <w:noProof/>
           <w:highlight w:val="lightGray"/>
         </w:rPr>
         <w:drawing>
@@ -2379,21 +1877,7 @@
         <w:rPr>
           <w:highlight w:val="lightGray"/>
         </w:rPr>
-        <w:t>{{section2_</w:t>
-      </w:r>
-      <w:proofErr w:type="gramStart"/>
-      <w:r>
-        <w:rPr>
-          <w:highlight w:val="lightGray"/>
-        </w:rPr>
-        <w:t>firma.workplace</w:t>
-      </w:r>
-      <w:proofErr w:type="gramEnd"/>
-      <w:r>
-        <w:rPr>
-          <w:highlight w:val="lightGray"/>
-        </w:rPr>
-        <w:t>}}</w:t>
+        <w:t>{{section2_firma.workplace}}</w:t>
       </w:r>
       <w:r>
         <w:rPr>
@@ -2577,6 +2061,7 @@
             </w:pPr>
             <w:r>
               <w:rPr>
+                <w:noProof/>
                 <w:highlight w:val="lightGray"/>
               </w:rPr>
               <w:lastRenderedPageBreak/>
@@ -3403,37 +2888,7 @@
         <w:rPr>
           <w:highlight w:val="magenta"/>
         </w:rPr>
-        <w:t xml:space="preserve">{{Zde budou </w:t>
-      </w:r>
-      <w:proofErr w:type="spellStart"/>
-      <w:r>
-        <w:rPr>
-          <w:highlight w:val="magenta"/>
-        </w:rPr>
-        <w:t>inicály</w:t>
-      </w:r>
-      <w:proofErr w:type="spellEnd"/>
-      <w:r>
-        <w:rPr>
-          <w:highlight w:val="magenta"/>
-        </w:rPr>
-        <w:t xml:space="preserve"> pracovníků, tzn: První písmeno jména prvního pracovníka. První písmeno příjmení prvního pracovníka., </w:t>
-      </w:r>
-      <w:proofErr w:type="spellStart"/>
-      <w:proofErr w:type="gramStart"/>
-      <w:r>
-        <w:rPr>
-          <w:highlight w:val="magenta"/>
-        </w:rPr>
-        <w:t>druhý.druhý</w:t>
-      </w:r>
-      <w:proofErr w:type="spellEnd"/>
-      <w:proofErr w:type="gramEnd"/>
-      <w:r>
-        <w:rPr>
-          <w:highlight w:val="magenta"/>
-        </w:rPr>
-        <w:t>…}}</w:t>
+        <w:t>{{Zde budou inicály pracovníků, tzn: První písmeno jména prvního pracovníka. První písmeno příjmení prvního pracovníka., druhý.druhý…}}</w:t>
       </w:r>
       <w:r>
         <w:rPr>
@@ -3463,44 +2918,16 @@
         <w:rPr>
           <w:highlight w:val="magenta"/>
         </w:rPr>
-        <w:t>{{section2_</w:t>
-      </w:r>
-      <w:proofErr w:type="gramStart"/>
+        <w:t>{{section2_firma.workplace}}</w:t>
+      </w:r>
+      <w:r>
+        <w:t xml:space="preserve"> na pozici </w:t>
+      </w:r>
       <w:r>
         <w:rPr>
           <w:highlight w:val="magenta"/>
         </w:rPr>
-        <w:t>firma.workplace</w:t>
-      </w:r>
-      <w:proofErr w:type="gramEnd"/>
-      <w:r>
-        <w:rPr>
-          <w:highlight w:val="magenta"/>
-        </w:rPr>
-        <w:t>}}</w:t>
-      </w:r>
-      <w:r>
-        <w:t xml:space="preserve"> na pozici </w:t>
-      </w:r>
-      <w:r>
-        <w:rPr>
-          <w:highlight w:val="magenta"/>
-        </w:rPr>
-        <w:t>{{section2_</w:t>
-      </w:r>
-      <w:proofErr w:type="gramStart"/>
-      <w:r>
-        <w:rPr>
-          <w:highlight w:val="magenta"/>
-        </w:rPr>
-        <w:t>firma.profession</w:t>
-      </w:r>
-      <w:proofErr w:type="gramEnd"/>
-      <w:r>
-        <w:rPr>
-          <w:highlight w:val="magenta"/>
-        </w:rPr>
-        <w:t>_name}}</w:t>
+        <w:t>{{section2_firma.profession_name}}</w:t>
       </w:r>
       <w:r>
         <w:rPr>
@@ -3830,21 +3257,7 @@
               <w:rPr>
                 <w:highlight w:val="magenta"/>
               </w:rPr>
-              <w:t>{{</w:t>
-            </w:r>
-            <w:proofErr w:type="spellStart"/>
-            <w:r>
-              <w:rPr>
-                <w:highlight w:val="magenta"/>
-              </w:rPr>
-              <w:t>inicály</w:t>
-            </w:r>
-            <w:proofErr w:type="spellEnd"/>
-            <w:r>
-              <w:rPr>
-                <w:highlight w:val="magenta"/>
-              </w:rPr>
-              <w:t xml:space="preserve"> prvního}}</w:t>
+              <w:t>{{inicály prvního}}</w:t>
             </w:r>
           </w:p>
         </w:tc>
@@ -3864,21 +3277,7 @@
               <w:rPr>
                 <w:highlight w:val="magenta"/>
               </w:rPr>
-              <w:t>{{section4_worker_</w:t>
-            </w:r>
-            <w:proofErr w:type="gramStart"/>
-            <w:r>
-              <w:rPr>
-                <w:highlight w:val="magenta"/>
-              </w:rPr>
-              <w:t>a.laterality</w:t>
-            </w:r>
-            <w:proofErr w:type="gramEnd"/>
-            <w:r>
-              <w:rPr>
-                <w:highlight w:val="magenta"/>
-              </w:rPr>
-              <w:t>}}</w:t>
+              <w:t>{{section4_worker_a.laterality}}</w:t>
             </w:r>
           </w:p>
         </w:tc>
@@ -3932,21 +3331,7 @@
               <w:rPr>
                 <w:highlight w:val="magenta"/>
               </w:rPr>
-              <w:t>{{section4_worker_</w:t>
-            </w:r>
-            <w:proofErr w:type="gramStart"/>
-            <w:r>
-              <w:rPr>
-                <w:highlight w:val="magenta"/>
-              </w:rPr>
-              <w:t>a.height</w:t>
-            </w:r>
-            <w:proofErr w:type="gramEnd"/>
-            <w:r>
-              <w:rPr>
-                <w:highlight w:val="magenta"/>
-              </w:rPr>
-              <w:t>_cm}}</w:t>
+              <w:t>{{section4_worker_a.height_cm}}</w:t>
             </w:r>
           </w:p>
         </w:tc>
@@ -3966,21 +3351,7 @@
               <w:rPr>
                 <w:highlight w:val="magenta"/>
               </w:rPr>
-              <w:t>{{section4_worker_</w:t>
-            </w:r>
-            <w:proofErr w:type="gramStart"/>
-            <w:r>
-              <w:rPr>
-                <w:highlight w:val="magenta"/>
-              </w:rPr>
-              <w:t>a.weight</w:t>
-            </w:r>
-            <w:proofErr w:type="gramEnd"/>
-            <w:r>
-              <w:rPr>
-                <w:highlight w:val="magenta"/>
-              </w:rPr>
-              <w:t>_kg}}</w:t>
+              <w:t>{{section4_worker_a.weight_kg}}</w:t>
             </w:r>
           </w:p>
         </w:tc>
@@ -4046,21 +3417,7 @@
               <w:rPr>
                 <w:highlight w:val="magenta"/>
               </w:rPr>
-              <w:t>{{section5_worker_</w:t>
-            </w:r>
-            <w:proofErr w:type="gramStart"/>
-            <w:r>
-              <w:rPr>
-                <w:highlight w:val="magenta"/>
-              </w:rPr>
-              <w:t>b.laterality</w:t>
-            </w:r>
-            <w:proofErr w:type="gramEnd"/>
-            <w:r>
-              <w:rPr>
-                <w:highlight w:val="magenta"/>
-              </w:rPr>
-              <w:t>}}</w:t>
+              <w:t>{{section5_worker_b.laterality}}</w:t>
             </w:r>
           </w:p>
         </w:tc>
@@ -4120,21 +3477,7 @@
               <w:rPr>
                 <w:highlight w:val="magenta"/>
               </w:rPr>
-              <w:t>{{section5_worker_</w:t>
-            </w:r>
-            <w:proofErr w:type="gramStart"/>
-            <w:r>
-              <w:rPr>
-                <w:highlight w:val="magenta"/>
-              </w:rPr>
-              <w:t>b.height</w:t>
-            </w:r>
-            <w:proofErr w:type="gramEnd"/>
-            <w:r>
-              <w:rPr>
-                <w:highlight w:val="magenta"/>
-              </w:rPr>
-              <w:t>_cm}}</w:t>
+              <w:t>{{section5_worker_b.height_cm}}</w:t>
             </w:r>
           </w:p>
         </w:tc>
@@ -4157,21 +3500,7 @@
               <w:rPr>
                 <w:highlight w:val="magenta"/>
               </w:rPr>
-              <w:t>{{section5_worker_</w:t>
-            </w:r>
-            <w:proofErr w:type="gramStart"/>
-            <w:r>
-              <w:rPr>
-                <w:highlight w:val="magenta"/>
-              </w:rPr>
-              <w:t>b.weight</w:t>
-            </w:r>
-            <w:proofErr w:type="gramEnd"/>
-            <w:r>
-              <w:rPr>
-                <w:highlight w:val="magenta"/>
-              </w:rPr>
-              <w:t>_kg}}</w:t>
+              <w:t>{{section5_worker_b.weight_kg}}</w:t>
             </w:r>
           </w:p>
         </w:tc>
@@ -4298,48 +3627,78 @@
         <w:rPr>
           <w:highlight w:val="magenta"/>
         </w:rPr>
-        <w:t xml:space="preserve">{{tento řádek vymazat, pokud </w:t>
-      </w:r>
-      <w:proofErr w:type="spellStart"/>
+        <w:t>{{tento řádek vymazat, pokud jso v protokolu 2 osoby.}}</w:t>
+      </w:r>
+    </w:p>
+    <w:p>
+      <w:pPr>
+        <w:jc w:val="both"/>
+      </w:pPr>
+    </w:p>
+    <w:bookmarkEnd w:id="11"/>
+    <w:p>
+      <w:pPr>
+        <w:jc w:val="both"/>
+      </w:pPr>
+    </w:p>
+    <w:p>
+      <w:pPr>
+        <w:spacing w:line="276" w:lineRule="auto"/>
+        <w:jc w:val="both"/>
+      </w:pPr>
+      <w:bookmarkStart w:id="12" w:name="_Hlk163640739"/>
+      <w:r>
+        <w:t>Směna:</w:t>
+      </w:r>
+      <w:r>
+        <w:tab/>
+      </w:r>
+      <w:r>
+        <w:tab/>
+      </w:r>
+      <w:r>
+        <w:tab/>
+      </w:r>
+      <w:r>
+        <w:tab/>
+      </w:r>
       <w:r>
         <w:rPr>
           <w:highlight w:val="magenta"/>
         </w:rPr>
-        <w:t>jso</w:t>
-      </w:r>
-      <w:proofErr w:type="spellEnd"/>
+        <w:t>{{section4_worker_a.work_duration}}</w:t>
+      </w:r>
+      <w:r>
+        <w:t xml:space="preserve"> min</w:t>
+      </w:r>
+    </w:p>
+    <w:p>
+      <w:pPr>
+        <w:spacing w:line="276" w:lineRule="auto"/>
+        <w:jc w:val="both"/>
+      </w:pPr>
+      <w:r>
+        <w:t>Přestávka na jídlo a oddech:</w:t>
+      </w:r>
+      <w:r>
+        <w:tab/>
+      </w:r>
       <w:r>
         <w:rPr>
           <w:highlight w:val="magenta"/>
         </w:rPr>
-        <w:t xml:space="preserve"> v protokolu 2 osoby.}}</w:t>
+        <w:t>{{section4_worker_a.breaks}}</w:t>
+      </w:r>
+      <w:r>
+        <w:t xml:space="preserve"> min</w:t>
       </w:r>
     </w:p>
     <w:p>
       <w:pPr>
-        <w:jc w:val="both"/>
-      </w:pPr>
-    </w:p>
-    <w:bookmarkEnd w:id="11"/>
-    <w:p>
-      <w:pPr>
-        <w:jc w:val="both"/>
-      </w:pPr>
-    </w:p>
-    <w:p>
-      <w:pPr>
         <w:spacing w:line="276" w:lineRule="auto"/>
-        <w:jc w:val="both"/>
-      </w:pPr>
-      <w:bookmarkStart w:id="12" w:name="_Hlk163640739"/>
-      <w:r>
-        <w:t>Směna:</w:t>
-      </w:r>
-      <w:r>
-        <w:tab/>
-      </w:r>
-      <w:r>
-        <w:tab/>
+      </w:pPr>
+      <w:r>
+        <w:t xml:space="preserve">Doba výkonu práce: </w:t>
       </w:r>
       <w:r>
         <w:tab/>
@@ -4351,130 +3710,22 @@
         <w:rPr>
           <w:highlight w:val="magenta"/>
         </w:rPr>
-        <w:t>{{section4_worker_</w:t>
-      </w:r>
-      <w:proofErr w:type="gramStart"/>
+        <w:t>{{section4_worker_a.work_duration}}</w:t>
+      </w:r>
+      <w:r>
+        <w:t xml:space="preserve"> </w:t>
+      </w:r>
+      <w:r>
+        <w:t xml:space="preserve"> min</w:t>
+      </w:r>
+      <w:r>
+        <w:t xml:space="preserve"> + </w:t>
+      </w:r>
       <w:r>
         <w:rPr>
           <w:highlight w:val="magenta"/>
         </w:rPr>
-        <w:t>a.work</w:t>
-      </w:r>
-      <w:proofErr w:type="gramEnd"/>
-      <w:r>
-        <w:rPr>
-          <w:highlight w:val="magenta"/>
-        </w:rPr>
-        <w:t>_duration}}</w:t>
-      </w:r>
-      <w:r>
-        <w:t xml:space="preserve"> min</w:t>
-      </w:r>
-    </w:p>
-    <w:p>
-      <w:pPr>
-        <w:spacing w:line="276" w:lineRule="auto"/>
-        <w:jc w:val="both"/>
-      </w:pPr>
-      <w:r>
-        <w:t>Přestávka na jídlo a oddech:</w:t>
-      </w:r>
-      <w:r>
-        <w:tab/>
-      </w:r>
-      <w:r>
-        <w:rPr>
-          <w:highlight w:val="magenta"/>
-        </w:rPr>
-        <w:t>{{section4_worker_</w:t>
-      </w:r>
-      <w:proofErr w:type="gramStart"/>
-      <w:r>
-        <w:rPr>
-          <w:highlight w:val="magenta"/>
-        </w:rPr>
-        <w:t>a.breaks</w:t>
-      </w:r>
-      <w:proofErr w:type="gramEnd"/>
-      <w:r>
-        <w:rPr>
-          <w:highlight w:val="magenta"/>
-        </w:rPr>
-        <w:t>}}</w:t>
-      </w:r>
-      <w:r>
-        <w:t xml:space="preserve"> min</w:t>
-      </w:r>
-    </w:p>
-    <w:p>
-      <w:pPr>
-        <w:spacing w:line="276" w:lineRule="auto"/>
-      </w:pPr>
-      <w:r>
-        <w:t xml:space="preserve">Doba výkonu práce: </w:t>
-      </w:r>
-      <w:r>
-        <w:tab/>
-      </w:r>
-      <w:r>
-        <w:tab/>
-      </w:r>
-      <w:r>
-        <w:rPr>
-          <w:highlight w:val="magenta"/>
-        </w:rPr>
-        <w:t>{{section4_worker_</w:t>
-      </w:r>
-      <w:proofErr w:type="gramStart"/>
-      <w:r>
-        <w:rPr>
-          <w:highlight w:val="magenta"/>
-        </w:rPr>
-        <w:t>a.work</w:t>
-      </w:r>
-      <w:proofErr w:type="gramEnd"/>
-      <w:r>
-        <w:rPr>
-          <w:highlight w:val="magenta"/>
-        </w:rPr>
-        <w:t>_duration</w:t>
-      </w:r>
-      <w:proofErr w:type="gramStart"/>
-      <w:r>
-        <w:rPr>
-          <w:highlight w:val="magenta"/>
-        </w:rPr>
-        <w:t>}}</w:t>
-      </w:r>
-      <w:r>
-        <w:t xml:space="preserve"> </w:t>
-      </w:r>
-      <w:r>
-        <w:t xml:space="preserve"> min</w:t>
-      </w:r>
-      <w:proofErr w:type="gramEnd"/>
-      <w:r>
-        <w:t xml:space="preserve"> + </w:t>
-      </w:r>
-      <w:r>
-        <w:rPr>
-          <w:highlight w:val="magenta"/>
-        </w:rPr>
-        <w:t>{{section4_worker_</w:t>
-      </w:r>
-      <w:proofErr w:type="gramStart"/>
-      <w:r>
-        <w:rPr>
-          <w:highlight w:val="magenta"/>
-        </w:rPr>
-        <w:t>a.breaks</w:t>
-      </w:r>
-      <w:proofErr w:type="gramEnd"/>
-      <w:r>
-        <w:rPr>
-          <w:highlight w:val="magenta"/>
-        </w:rPr>
-        <w:t>}}</w:t>
+        <w:t>{{section4_worker_a.breaks}}</w:t>
       </w:r>
       <w:r>
         <w:t xml:space="preserve"> min BP</w:t>
@@ -4598,35 +3849,7 @@
               <w:rPr>
                 <w:highlight w:val="magenta"/>
               </w:rPr>
-              <w:t>{{</w:t>
-            </w:r>
-            <w:proofErr w:type="spellStart"/>
-            <w:r>
-              <w:rPr>
-                <w:highlight w:val="magenta"/>
-              </w:rPr>
-              <w:t>inicály</w:t>
-            </w:r>
-            <w:proofErr w:type="spellEnd"/>
-            <w:r>
-              <w:rPr>
-                <w:highlight w:val="magenta"/>
-              </w:rPr>
-              <w:t xml:space="preserve"> </w:t>
-            </w:r>
-            <w:proofErr w:type="spellStart"/>
-            <w:r>
-              <w:rPr>
-                <w:highlight w:val="magenta"/>
-              </w:rPr>
-              <w:t>worker</w:t>
-            </w:r>
-            <w:proofErr w:type="spellEnd"/>
-            <w:r>
-              <w:rPr>
-                <w:highlight w:val="magenta"/>
-              </w:rPr>
-              <w:t xml:space="preserve"> a}}</w:t>
+              <w:t>{{inicály worker a}}</w:t>
             </w:r>
           </w:p>
         </w:tc>
@@ -4646,21 +3869,7 @@
               <w:rPr>
                 <w:highlight w:val="magenta"/>
               </w:rPr>
-              <w:t>{{section4_worker_</w:t>
-            </w:r>
-            <w:proofErr w:type="gramStart"/>
-            <w:r>
-              <w:rPr>
-                <w:highlight w:val="magenta"/>
-              </w:rPr>
-              <w:t>a.measurement</w:t>
-            </w:r>
-            <w:proofErr w:type="gramEnd"/>
-            <w:r>
-              <w:rPr>
-                <w:highlight w:val="magenta"/>
-              </w:rPr>
-              <w:t>_start}}</w:t>
+              <w:t>{{section4_worker_a.measurement_start}}</w:t>
             </w:r>
           </w:p>
         </w:tc>
@@ -4706,21 +3915,7 @@
               <w:rPr>
                 <w:highlight w:val="magenta"/>
               </w:rPr>
-              <w:t xml:space="preserve">{{iniciály </w:t>
-            </w:r>
-            <w:proofErr w:type="spellStart"/>
-            <w:r>
-              <w:rPr>
-                <w:highlight w:val="magenta"/>
-              </w:rPr>
-              <w:t>worker</w:t>
-            </w:r>
-            <w:proofErr w:type="spellEnd"/>
-            <w:r>
-              <w:rPr>
-                <w:highlight w:val="magenta"/>
-              </w:rPr>
-              <w:t xml:space="preserve"> b}}</w:t>
+              <w:t>{{iniciály worker b}}</w:t>
             </w:r>
           </w:p>
         </w:tc>
@@ -4740,21 +3935,7 @@
               <w:rPr>
                 <w:highlight w:val="magenta"/>
               </w:rPr>
-              <w:t>{{section4_worker_</w:t>
-            </w:r>
-            <w:proofErr w:type="gramStart"/>
-            <w:r>
-              <w:rPr>
-                <w:highlight w:val="magenta"/>
-              </w:rPr>
-              <w:t>b.measurement</w:t>
-            </w:r>
-            <w:proofErr w:type="gramEnd"/>
-            <w:r>
-              <w:rPr>
-                <w:highlight w:val="magenta"/>
-              </w:rPr>
-              <w:t>_start}}</w:t>
+              <w:t>{{section4_worker_b.measurement_start}}</w:t>
             </w:r>
           </w:p>
         </w:tc>
@@ -4770,15 +3951,7 @@
         <w:t>Výsledky měřených osob</w:t>
       </w:r>
       <w:r>
-        <w:t xml:space="preserve"> – síla % </w:t>
-      </w:r>
-      <w:proofErr w:type="spellStart"/>
-      <w:r>
-        <w:t>Fmax</w:t>
-      </w:r>
-      <w:proofErr w:type="spellEnd"/>
-      <w:r>
-        <w:t>:</w:t>
+        <w:t xml:space="preserve"> – síla % Fmax:</w:t>
       </w:r>
       <w:r>
         <w:t xml:space="preserve"> </w:t>
@@ -4787,21 +3960,7 @@
         <w:rPr>
           <w:highlight w:val="magenta"/>
         </w:rPr>
-        <w:t>{{Níže je tabulka, která je z </w:t>
-      </w:r>
-      <w:proofErr w:type="spellStart"/>
-      <w:r>
-        <w:rPr>
-          <w:highlight w:val="magenta"/>
-        </w:rPr>
-        <w:t>lsz</w:t>
-      </w:r>
-      <w:proofErr w:type="spellEnd"/>
-      <w:r>
-        <w:rPr>
-          <w:highlight w:val="magenta"/>
-        </w:rPr>
-        <w:t xml:space="preserve"> excelu, list celkové výsledky, levý horní roh má v B4 a pravý dolní roh (konec tabulky) je ve sloupci I, ale může být na jakémkoliv řádku, podle počtu činností.  Zde bude potřeba vymyslet logiku, jak poznat konec tabulky, protože pod ní je prázdný řádek, pak nadpis, pak prázdný řádek a pak další tabulka}}</w:t>
+        <w:t>{{Níže je tabulka, která je z lsz excelu, list celkové výsledky, levý horní roh má v B4 a pravý dolní roh (konec tabulky) je ve sloupci I, ale může být na jakémkoliv řádku, podle počtu činností.  Zde bude potřeba vymyslet logiku, jak poznat konec tabulky, protože pod ní je prázdný řádek, pak nadpis, pak prázdný řádek a pak další tabulka}}</w:t>
       </w:r>
     </w:p>
     <w:tbl>
@@ -4999,21 +4158,7 @@
               <w:rPr>
                 <w:highlight w:val="magenta"/>
               </w:rPr>
-              <w:t xml:space="preserve">PHK [% </w:t>
-            </w:r>
-            <w:proofErr w:type="spellStart"/>
-            <w:r>
-              <w:rPr>
-                <w:highlight w:val="magenta"/>
-              </w:rPr>
-              <w:t>Fmax</w:t>
-            </w:r>
-            <w:proofErr w:type="spellEnd"/>
-            <w:r>
-              <w:rPr>
-                <w:highlight w:val="magenta"/>
-              </w:rPr>
-              <w:t>]</w:t>
+              <w:t>PHK [% Fmax]</w:t>
             </w:r>
           </w:p>
         </w:tc>
@@ -5042,21 +4187,7 @@
               <w:rPr>
                 <w:highlight w:val="magenta"/>
               </w:rPr>
-              <w:t xml:space="preserve">LHK [% </w:t>
-            </w:r>
-            <w:proofErr w:type="spellStart"/>
-            <w:r>
-              <w:rPr>
-                <w:highlight w:val="magenta"/>
-              </w:rPr>
-              <w:t>Fmax</w:t>
-            </w:r>
-            <w:proofErr w:type="spellEnd"/>
-            <w:r>
-              <w:rPr>
-                <w:highlight w:val="magenta"/>
-              </w:rPr>
-              <w:t>]</w:t>
+              <w:t>LHK [% Fmax]</w:t>
             </w:r>
           </w:p>
         </w:tc>
@@ -6350,15 +5481,7 @@
       </w:r>
       <w:r>
         <w:tab/>
-        <w:t xml:space="preserve">Pracovní činnost „úklid“ nebyla měřena, v časovém vážení počítáno se 7 % </w:t>
-      </w:r>
-      <w:proofErr w:type="spellStart"/>
-      <w:r>
-        <w:t>Fmax</w:t>
-      </w:r>
-      <w:proofErr w:type="spellEnd"/>
-      <w:r>
-        <w:t>.</w:t>
+        <w:t>Pracovní činnost „úklid“ nebyla měřena, v časovém vážení počítáno se 7 % Fmax.</w:t>
       </w:r>
     </w:p>
     <w:p>
@@ -6381,15 +5504,7 @@
         <w:t>{{počet minut bezpečnostní přestávky}}</w:t>
       </w:r>
       <w:r>
-        <w:t xml:space="preserve">, v časovém vážení počítáno se 3 % </w:t>
-      </w:r>
-      <w:proofErr w:type="spellStart"/>
-      <w:r>
-        <w:t>Fmax</w:t>
-      </w:r>
-      <w:proofErr w:type="spellEnd"/>
-      <w:r>
-        <w:t>.</w:t>
+        <w:t>, v časovém vážení počítáno se 3 % Fmax.</w:t>
       </w:r>
       <w:r>
         <w:t xml:space="preserve"> </w:t>
@@ -8358,21 +7473,7 @@
         <w:rPr>
           <w:highlight w:val="magenta"/>
         </w:rPr>
-        <w:t xml:space="preserve">{{následující tabulka zase </w:t>
-      </w:r>
-      <w:proofErr w:type="spellStart"/>
-      <w:r>
-        <w:rPr>
-          <w:highlight w:val="magenta"/>
-        </w:rPr>
-        <w:t>lsz</w:t>
-      </w:r>
-      <w:proofErr w:type="spellEnd"/>
-      <w:r>
-        <w:rPr>
-          <w:highlight w:val="magenta"/>
-        </w:rPr>
-        <w:t xml:space="preserve"> excel, zase poslední list, ale tentokrát </w:t>
+        <w:t xml:space="preserve">{{následující tabulka zase lsz excel, zase poslední list, ale tentokrát </w:t>
       </w:r>
       <w:r>
         <w:rPr>
@@ -8387,19 +7488,11 @@
           <w:highlight w:val="magenta"/>
         </w:rPr>
       </w:pPr>
-      <w:proofErr w:type="gramStart"/>
       <w:r>
         <w:rPr>
           <w:highlight w:val="magenta"/>
         </w:rPr>
-        <w:t>:,</w:t>
-      </w:r>
-      <w:proofErr w:type="gramEnd"/>
-      <w:r>
-        <w:rPr>
-          <w:highlight w:val="magenta"/>
-        </w:rPr>
-        <w:t xml:space="preserve"> prázdný řádek a poté začíná tato tabulka</w:t>
+        <w:t>:, prázdný řádek a poté začíná tato tabulka</w:t>
       </w:r>
       <w:r>
         <w:rPr>
@@ -8519,16 +7612,8 @@
               <w:rPr>
                 <w:highlight w:val="magenta"/>
               </w:rPr>
-              <w:t xml:space="preserve">PHK [%] </w:t>
-            </w:r>
-            <w:proofErr w:type="spellStart"/>
-            <w:r>
-              <w:rPr>
-                <w:highlight w:val="magenta"/>
-              </w:rPr>
-              <w:t>Fmax</w:t>
-            </w:r>
-            <w:proofErr w:type="spellEnd"/>
+              <w:t>PHK [%] Fmax</w:t>
+            </w:r>
           </w:p>
         </w:tc>
         <w:tc>
@@ -8598,16 +7683,8 @@
               <w:rPr>
                 <w:highlight w:val="magenta"/>
               </w:rPr>
-              <w:t xml:space="preserve">LHK [%] </w:t>
-            </w:r>
-            <w:proofErr w:type="spellStart"/>
-            <w:r>
-              <w:rPr>
-                <w:highlight w:val="magenta"/>
-              </w:rPr>
-              <w:t>Fmax</w:t>
-            </w:r>
-            <w:proofErr w:type="spellEnd"/>
+              <w:t>LHK [%] Fmax</w:t>
+            </w:r>
           </w:p>
         </w:tc>
         <w:tc>
@@ -9485,21 +8562,7 @@
               <w:rPr>
                 <w:highlight w:val="magenta"/>
               </w:rPr>
-              <w:t xml:space="preserve">(!!!Zapsat dle aktuálního snížení/zvýšení </w:t>
-            </w:r>
-            <w:proofErr w:type="spellStart"/>
-            <w:r>
-              <w:rPr>
-                <w:highlight w:val="magenta"/>
-              </w:rPr>
-              <w:t>hyg</w:t>
-            </w:r>
-            <w:proofErr w:type="spellEnd"/>
-            <w:r>
-              <w:rPr>
-                <w:highlight w:val="magenta"/>
-              </w:rPr>
-              <w:t>. Limitu)</w:t>
+              <w:t>(!!!Zapsat dle aktuálního snížení/zvýšení hyg. Limitu)</w:t>
             </w:r>
           </w:p>
         </w:tc>
@@ -9527,21 +8590,7 @@
               <w:rPr>
                 <w:highlight w:val="magenta"/>
               </w:rPr>
-              <w:t xml:space="preserve">(!!!Zapsat dle aktuálního snížení/zvýšení </w:t>
-            </w:r>
-            <w:proofErr w:type="spellStart"/>
-            <w:r>
-              <w:rPr>
-                <w:highlight w:val="magenta"/>
-              </w:rPr>
-              <w:t>hyg</w:t>
-            </w:r>
-            <w:proofErr w:type="spellEnd"/>
-            <w:r>
-              <w:rPr>
-                <w:highlight w:val="magenta"/>
-              </w:rPr>
-              <w:t>. Limitu)</w:t>
+              <w:t>(!!!Zapsat dle aktuálního snížení/zvýšení hyg. Limitu)</w:t>
             </w:r>
           </w:p>
         </w:tc>
@@ -9597,21 +8646,7 @@
               <w:rPr>
                 <w:highlight w:val="magenta"/>
               </w:rPr>
-              <w:t xml:space="preserve">(!!!Zapsat dle aktuálního snížení/zvýšení </w:t>
-            </w:r>
-            <w:proofErr w:type="spellStart"/>
-            <w:r>
-              <w:rPr>
-                <w:highlight w:val="magenta"/>
-              </w:rPr>
-              <w:t>hyg</w:t>
-            </w:r>
-            <w:proofErr w:type="spellEnd"/>
-            <w:r>
-              <w:rPr>
-                <w:highlight w:val="magenta"/>
-              </w:rPr>
-              <w:t>. Limitu)</w:t>
+              <w:t>(!!!Zapsat dle aktuálního snížení/zvýšení hyg. Limitu)</w:t>
             </w:r>
           </w:p>
         </w:tc>
@@ -9638,21 +8673,7 @@
               <w:rPr>
                 <w:highlight w:val="magenta"/>
               </w:rPr>
-              <w:t xml:space="preserve">(!!!Zapsat dle aktuálního snížení/zvýšení </w:t>
-            </w:r>
-            <w:proofErr w:type="spellStart"/>
-            <w:r>
-              <w:rPr>
-                <w:highlight w:val="magenta"/>
-              </w:rPr>
-              <w:t>hyg</w:t>
-            </w:r>
-            <w:proofErr w:type="spellEnd"/>
-            <w:r>
-              <w:rPr>
-                <w:highlight w:val="magenta"/>
-              </w:rPr>
-              <w:t>. Limitu)</w:t>
+              <w:t>(!!!Zapsat dle aktuálního snížení/zvýšení hyg. Limitu)</w:t>
             </w:r>
           </w:p>
         </w:tc>
@@ -9829,16 +8850,8 @@
               <w:rPr>
                 <w:highlight w:val="magenta"/>
               </w:rPr>
-              <w:t xml:space="preserve">Výskyt sil 55-70 % </w:t>
-            </w:r>
-            <w:proofErr w:type="spellStart"/>
-            <w:r>
-              <w:rPr>
-                <w:highlight w:val="magenta"/>
-              </w:rPr>
-              <w:t>Fmax</w:t>
-            </w:r>
-            <w:proofErr w:type="spellEnd"/>
+              <w:t>Výskyt sil 55-70 % Fmax</w:t>
+            </w:r>
           </w:p>
         </w:tc>
         <w:tc>
@@ -9866,30 +8879,8 @@
               <w:rPr>
                 <w:highlight w:val="magenta"/>
               </w:rPr>
-              <w:t xml:space="preserve">Výskyt </w:t>
-            </w:r>
-            <w:proofErr w:type="gramStart"/>
-            <w:r>
-              <w:rPr>
-                <w:highlight w:val="magenta"/>
-              </w:rPr>
-              <w:t>sil &gt;</w:t>
-            </w:r>
-            <w:proofErr w:type="gramEnd"/>
-            <w:r>
-              <w:rPr>
-                <w:highlight w:val="magenta"/>
-              </w:rPr>
-              <w:t xml:space="preserve"> 70 % </w:t>
-            </w:r>
-            <w:proofErr w:type="spellStart"/>
-            <w:r>
-              <w:rPr>
-                <w:highlight w:val="magenta"/>
-              </w:rPr>
-              <w:t>Fmax</w:t>
-            </w:r>
-            <w:proofErr w:type="spellEnd"/>
+              <w:t>Výskyt sil &gt; 70 % Fmax</w:t>
+            </w:r>
           </w:p>
         </w:tc>
       </w:tr>
@@ -13098,15 +12089,7 @@
         <w:jc w:val="both"/>
       </w:pPr>
       <w:r>
-        <w:t xml:space="preserve">Pozn.: Průměrný hygienický limit pro počet vynakládaných svalových sil v rozmezí 55 až 70 % </w:t>
-      </w:r>
-      <w:proofErr w:type="spellStart"/>
-      <w:r>
-        <w:t>Fmax</w:t>
-      </w:r>
-      <w:proofErr w:type="spellEnd"/>
-      <w:r>
-        <w:t xml:space="preserve"> u práce s převahou    </w:t>
+        <w:t xml:space="preserve">Pozn.: Průměrný hygienický limit pro počet vynakládaných svalových sil v rozmezí 55 až 70 % Fmax u práce s převahou    </w:t>
       </w:r>
     </w:p>
     <w:p>
@@ -13285,21 +12268,7 @@
               <w:rPr>
                 <w:highlight w:val="magenta"/>
               </w:rPr>
-              <w:t>{{section2_</w:t>
-            </w:r>
-            <w:proofErr w:type="gramStart"/>
-            <w:r>
-              <w:rPr>
-                <w:highlight w:val="magenta"/>
-              </w:rPr>
-              <w:t>firma.profession</w:t>
-            </w:r>
-            <w:proofErr w:type="gramEnd"/>
-            <w:r>
-              <w:rPr>
-                <w:highlight w:val="magenta"/>
-              </w:rPr>
-              <w:t>_name}}</w:t>
+              <w:t>{{section2_firma.profession_name}}</w:t>
             </w:r>
           </w:p>
         </w:tc>
@@ -13339,21 +12308,7 @@
               <w:rPr>
                 <w:highlight w:val="magenta"/>
               </w:rPr>
-              <w:t>{{section2_</w:t>
-            </w:r>
-            <w:proofErr w:type="gramStart"/>
-            <w:r>
-              <w:rPr>
-                <w:highlight w:val="magenta"/>
-              </w:rPr>
-              <w:t>firma.workplace</w:t>
-            </w:r>
-            <w:proofErr w:type="gramEnd"/>
-            <w:r>
-              <w:rPr>
-                <w:highlight w:val="magenta"/>
-              </w:rPr>
-              <w:t>}}</w:t>
+              <w:t>{{section2_firma.workplace}}</w:t>
             </w:r>
           </w:p>
         </w:tc>
@@ -13415,21 +12370,7 @@
               <w:rPr>
                 <w:highlight w:val="magenta"/>
               </w:rPr>
-              <w:t>{{section4_worker_</w:t>
-            </w:r>
-            <w:proofErr w:type="gramStart"/>
-            <w:r>
-              <w:rPr>
-                <w:highlight w:val="magenta"/>
-              </w:rPr>
-              <w:t>a.work</w:t>
-            </w:r>
-            <w:proofErr w:type="gramEnd"/>
-            <w:r>
-              <w:rPr>
-                <w:highlight w:val="magenta"/>
-              </w:rPr>
-              <w:t>_duration}}</w:t>
+              <w:t>{{section4_worker_a.work_duration}}</w:t>
             </w:r>
           </w:p>
         </w:tc>
@@ -13463,21 +12404,7 @@
               <w:rPr>
                 <w:highlight w:val="magenta"/>
               </w:rPr>
-              <w:t>{{section4_worker_</w:t>
-            </w:r>
-            <w:proofErr w:type="gramStart"/>
-            <w:r>
-              <w:rPr>
-                <w:highlight w:val="magenta"/>
-              </w:rPr>
-              <w:t>a.breaks</w:t>
-            </w:r>
-            <w:proofErr w:type="gramEnd"/>
-            <w:r>
-              <w:rPr>
-                <w:highlight w:val="magenta"/>
-              </w:rPr>
-              <w:t>}}</w:t>
+              <w:t>{{section4_worker_a.breaks}}</w:t>
             </w:r>
           </w:p>
         </w:tc>
@@ -13514,21 +12441,7 @@
               <w:rPr>
                 <w:highlight w:val="magenta"/>
               </w:rPr>
-              <w:t>{{section4_worker_</w:t>
-            </w:r>
-            <w:proofErr w:type="gramStart"/>
-            <w:r>
-              <w:rPr>
-                <w:highlight w:val="magenta"/>
-              </w:rPr>
-              <w:t>a.work</w:t>
-            </w:r>
-            <w:proofErr w:type="gramEnd"/>
-            <w:r>
-              <w:rPr>
-                <w:highlight w:val="magenta"/>
-              </w:rPr>
-              <w:t>_duration}}</w:t>
+              <w:t>{{section4_worker_a.work_duration}}</w:t>
             </w:r>
             <w:r>
               <w:rPr>
@@ -13540,21 +12453,7 @@
               <w:rPr>
                 <w:highlight w:val="magenta"/>
               </w:rPr>
-              <w:t>{{section4_worker_</w:t>
-            </w:r>
-            <w:proofErr w:type="gramStart"/>
-            <w:r>
-              <w:rPr>
-                <w:highlight w:val="magenta"/>
-              </w:rPr>
-              <w:t>a.breaks</w:t>
-            </w:r>
-            <w:proofErr w:type="gramEnd"/>
-            <w:r>
-              <w:rPr>
-                <w:highlight w:val="magenta"/>
-              </w:rPr>
-              <w:t>}}</w:t>
+              <w:t>{{section4_worker_a.breaks}}</w:t>
             </w:r>
             <w:r>
               <w:rPr>
@@ -13584,15 +12483,7 @@
               <w:t>/Navýšení</w:t>
             </w:r>
             <w:r>
-              <w:t xml:space="preserve"> </w:t>
-            </w:r>
-            <w:proofErr w:type="spellStart"/>
-            <w:r>
-              <w:t>hyg</w:t>
-            </w:r>
-            <w:proofErr w:type="spellEnd"/>
-            <w:r>
-              <w:t>.</w:t>
+              <w:t xml:space="preserve"> hyg.</w:t>
             </w:r>
             <w:r>
               <w:t xml:space="preserve"> limitu</w:t>
@@ -13658,21 +12549,7 @@
         <w:rPr>
           <w:highlight w:val="magenta"/>
         </w:rPr>
-        <w:t xml:space="preserve">{{Níže jsou dva grafy, ty jsou vloženy vedle sebe z excelu </w:t>
-      </w:r>
-      <w:proofErr w:type="spellStart"/>
-      <w:r>
-        <w:rPr>
-          <w:highlight w:val="magenta"/>
-        </w:rPr>
-        <w:t>lsz</w:t>
-      </w:r>
-      <w:proofErr w:type="spellEnd"/>
-      <w:r>
-        <w:rPr>
-          <w:highlight w:val="magenta"/>
-        </w:rPr>
-        <w:t>, list celkové výsledky. Nevím, jak ti je zde označit, jsou to jediné grafy v tom listu.}}</w:t>
+        <w:t>{{Níže jsou dva grafy, ty jsou vloženy vedle sebe z excelu lsz, list celkové výsledky. Nevím, jak ti je zde označit, jsou to jediné grafy v tom listu.}}</w:t>
       </w:r>
     </w:p>
     <w:p>
@@ -13681,6 +12558,7 @@
       </w:pPr>
       <w:r>
         <w:rPr>
+          <w:noProof/>
           <w:highlight w:val="magenta"/>
         </w:rPr>
         <w:drawing>
@@ -13713,6 +12591,7 @@
       </w:r>
       <w:r>
         <w:rPr>
+          <w:noProof/>
           <w:highlight w:val="magenta"/>
         </w:rPr>
         <w:drawing>
@@ -13764,63 +12643,19 @@
         <w:rPr>
           <w:highlight w:val="magenta"/>
         </w:rPr>
-        <w:t>{{</w:t>
-      </w:r>
-      <w:proofErr w:type="spellStart"/>
+        <w:t>{{lsz excel, list celkové výsledky, K45}}</w:t>
+      </w:r>
+      <w:r>
+        <w:t xml:space="preserve"> % Fmax, flexorů pravého předloktí </w:t>
+      </w:r>
       <w:r>
         <w:rPr>
           <w:highlight w:val="magenta"/>
         </w:rPr>
-        <w:t>lsz</w:t>
-      </w:r>
-      <w:proofErr w:type="spellEnd"/>
-      <w:r>
-        <w:rPr>
-          <w:highlight w:val="magenta"/>
-        </w:rPr>
-        <w:t xml:space="preserve"> excel, list celkové výsledky, K45}}</w:t>
-      </w:r>
-      <w:r>
-        <w:t xml:space="preserve"> % </w:t>
-      </w:r>
-      <w:proofErr w:type="spellStart"/>
-      <w:r>
-        <w:t>Fmax</w:t>
-      </w:r>
-      <w:proofErr w:type="spellEnd"/>
-      <w:r>
-        <w:t xml:space="preserve">, flexorů pravého předloktí </w:t>
-      </w:r>
-      <w:r>
-        <w:rPr>
-          <w:highlight w:val="magenta"/>
-        </w:rPr>
-        <w:t>{{</w:t>
-      </w:r>
-      <w:proofErr w:type="spellStart"/>
-      <w:r>
-        <w:rPr>
-          <w:highlight w:val="magenta"/>
-        </w:rPr>
-        <w:t>lsz</w:t>
-      </w:r>
-      <w:proofErr w:type="spellEnd"/>
-      <w:r>
-        <w:rPr>
-          <w:highlight w:val="magenta"/>
-        </w:rPr>
-        <w:t xml:space="preserve"> excel, celkové výsledky, L45}}</w:t>
-      </w:r>
-      <w:r>
-        <w:t xml:space="preserve"> % </w:t>
-      </w:r>
-      <w:proofErr w:type="spellStart"/>
-      <w:r>
-        <w:t>Fmax</w:t>
-      </w:r>
-      <w:proofErr w:type="spellEnd"/>
-      <w:r>
-        <w:t xml:space="preserve">. Průměrné počty pohybů PHK </w:t>
+        <w:t>{{lsz excel, celkové výsledky, L45}}</w:t>
+      </w:r>
+      <w:r>
+        <w:t xml:space="preserve"> % Fmax. Průměrné počty pohybů PHK </w:t>
       </w:r>
       <w:r>
         <w:rPr>
@@ -13832,35 +12667,7 @@
         <w:rPr>
           <w:highlight w:val="magenta"/>
         </w:rPr>
-        <w:t>{{</w:t>
-      </w:r>
-      <w:proofErr w:type="spellStart"/>
-      <w:r>
-        <w:rPr>
-          <w:highlight w:val="magenta"/>
-        </w:rPr>
-        <w:t>lsz</w:t>
-      </w:r>
-      <w:proofErr w:type="spellEnd"/>
-      <w:r>
-        <w:rPr>
-          <w:highlight w:val="magenta"/>
-        </w:rPr>
-        <w:t xml:space="preserve"> excel, </w:t>
-      </w:r>
-      <w:proofErr w:type="spellStart"/>
-      <w:r>
-        <w:rPr>
-          <w:highlight w:val="magenta"/>
-        </w:rPr>
-        <w:t>celkove</w:t>
-      </w:r>
-      <w:proofErr w:type="spellEnd"/>
-      <w:r>
-        <w:rPr>
-          <w:highlight w:val="magenta"/>
-        </w:rPr>
-        <w:t xml:space="preserve"> výsledky, m45}}</w:t>
+        <w:t>{{lsz excel, celkove výsledky, m45}}</w:t>
       </w:r>
       <w:r>
         <w:t xml:space="preserve">) </w:t>
@@ -13975,21 +12782,7 @@
         <w:rPr>
           <w:highlight w:val="magenta"/>
         </w:rPr>
-        <w:t xml:space="preserve">Počet pohybů pravé </w:t>
-      </w:r>
-      <w:proofErr w:type="spellStart"/>
-      <w:r>
-        <w:rPr>
-          <w:highlight w:val="magenta"/>
-        </w:rPr>
-        <w:t>hk</w:t>
-      </w:r>
-      <w:proofErr w:type="spellEnd"/>
-      <w:r>
-        <w:rPr>
-          <w:highlight w:val="magenta"/>
-        </w:rPr>
-        <w:t xml:space="preserve"> M45</w:t>
+        <w:t>Počet pohybů pravé hk M45</w:t>
       </w:r>
     </w:p>
     <w:p>
@@ -14034,21 +12827,7 @@
         <w:rPr>
           <w:highlight w:val="magenta"/>
         </w:rPr>
-        <w:t xml:space="preserve">počet pohybů levé </w:t>
-      </w:r>
-      <w:proofErr w:type="spellStart"/>
-      <w:r>
-        <w:rPr>
-          <w:highlight w:val="magenta"/>
-        </w:rPr>
-        <w:t>hk</w:t>
-      </w:r>
-      <w:proofErr w:type="spellEnd"/>
-      <w:r>
-        <w:rPr>
-          <w:highlight w:val="magenta"/>
-        </w:rPr>
-        <w:t xml:space="preserve"> S45</w:t>
+        <w:t>počet pohybů levé hk S45</w:t>
       </w:r>
     </w:p>
     <w:p>
@@ -14087,21 +12866,7 @@
         <w:rPr>
           <w:highlight w:val="magenta"/>
         </w:rPr>
-        <w:t xml:space="preserve">Například řádek 36 obsahuje Fmax38 a počet pohybů 5200. Takže logika je taková, že musíš vzít hodnotu </w:t>
-      </w:r>
-      <w:proofErr w:type="spellStart"/>
-      <w:r>
-        <w:rPr>
-          <w:highlight w:val="magenta"/>
-        </w:rPr>
-        <w:t>fmax</w:t>
-      </w:r>
-      <w:proofErr w:type="spellEnd"/>
-      <w:r>
-        <w:rPr>
-          <w:highlight w:val="magenta"/>
-        </w:rPr>
-        <w:t xml:space="preserve"> pro pravý extenzor a porovnat ji s tou tabulkou, jestli překračuje limit. a na základě výsledků a podmínek vybrat text. To stejné pro flexor.</w:t>
+        <w:t>Například řádek 36 obsahuje Fmax38 a počet pohybů 5200. Takže logika je taková, že musíš vzít hodnotu fmax pro pravý extenzor a porovnat ji s tou tabulkou, jestli překračuje limit. a na základě výsledků a podmínek vybrat text. To stejné pro flexor.</w:t>
       </w:r>
     </w:p>
     <w:p>
@@ -14143,91 +12908,19 @@
         <w:rPr>
           <w:highlight w:val="magenta"/>
         </w:rPr>
-        <w:t>{{</w:t>
-      </w:r>
-      <w:proofErr w:type="spellStart"/>
+        <w:t>{{lsz excel, celkove výsledky, o45}}</w:t>
+      </w:r>
+      <w:r>
+        <w:t xml:space="preserve"> % Fmax, flexorů levého předloktí </w:t>
+      </w:r>
       <w:r>
         <w:rPr>
           <w:highlight w:val="magenta"/>
         </w:rPr>
-        <w:t>lsz</w:t>
-      </w:r>
-      <w:proofErr w:type="spellEnd"/>
-      <w:r>
-        <w:rPr>
-          <w:highlight w:val="magenta"/>
-        </w:rPr>
-        <w:t xml:space="preserve"> excel, </w:t>
-      </w:r>
-      <w:proofErr w:type="spellStart"/>
-      <w:r>
-        <w:rPr>
-          <w:highlight w:val="magenta"/>
-        </w:rPr>
-        <w:t>celkove</w:t>
-      </w:r>
-      <w:proofErr w:type="spellEnd"/>
-      <w:r>
-        <w:rPr>
-          <w:highlight w:val="magenta"/>
-        </w:rPr>
-        <w:t xml:space="preserve"> výsledky, o45}}</w:t>
-      </w:r>
-      <w:r>
-        <w:t xml:space="preserve"> % </w:t>
-      </w:r>
-      <w:proofErr w:type="spellStart"/>
-      <w:r>
-        <w:t>Fmax</w:t>
-      </w:r>
-      <w:proofErr w:type="spellEnd"/>
-      <w:r>
-        <w:t xml:space="preserve">, flexorů levého předloktí </w:t>
-      </w:r>
-      <w:r>
-        <w:rPr>
-          <w:highlight w:val="magenta"/>
-        </w:rPr>
-        <w:t>{{</w:t>
-      </w:r>
-      <w:proofErr w:type="spellStart"/>
-      <w:r>
-        <w:rPr>
-          <w:highlight w:val="magenta"/>
-        </w:rPr>
-        <w:t>lsz</w:t>
-      </w:r>
-      <w:proofErr w:type="spellEnd"/>
-      <w:r>
-        <w:rPr>
-          <w:highlight w:val="magenta"/>
-        </w:rPr>
-        <w:t xml:space="preserve"> excel, </w:t>
-      </w:r>
-      <w:proofErr w:type="spellStart"/>
-      <w:r>
-        <w:rPr>
-          <w:highlight w:val="magenta"/>
-        </w:rPr>
-        <w:t>celkove</w:t>
-      </w:r>
-      <w:proofErr w:type="spellEnd"/>
-      <w:r>
-        <w:rPr>
-          <w:highlight w:val="magenta"/>
-        </w:rPr>
-        <w:t xml:space="preserve"> výsledky, Q45}}</w:t>
-      </w:r>
-      <w:r>
-        <w:t xml:space="preserve"> % </w:t>
-      </w:r>
-      <w:proofErr w:type="spellStart"/>
-      <w:r>
-        <w:t>Fmax</w:t>
-      </w:r>
-      <w:proofErr w:type="spellEnd"/>
-      <w:r>
-        <w:t xml:space="preserve">. Průměrné počty pohybů LHK </w:t>
+        <w:t>{{lsz excel, celkove výsledky, Q45}}</w:t>
+      </w:r>
+      <w:r>
+        <w:t xml:space="preserve"> % Fmax. Průměrné počty pohybů LHK </w:t>
       </w:r>
       <w:r>
         <w:rPr>
@@ -14239,21 +12932,7 @@
         <w:rPr>
           <w:highlight w:val="magenta"/>
         </w:rPr>
-        <w:t>{{</w:t>
-      </w:r>
-      <w:proofErr w:type="spellStart"/>
-      <w:r>
-        <w:rPr>
-          <w:highlight w:val="magenta"/>
-        </w:rPr>
-        <w:t>lsz</w:t>
-      </w:r>
-      <w:proofErr w:type="spellEnd"/>
-      <w:r>
-        <w:rPr>
-          <w:highlight w:val="magenta"/>
-        </w:rPr>
-        <w:t xml:space="preserve"> excel, celkové výsledky, s45}}</w:t>
+        <w:t>{{lsz excel, celkové výsledky, s45}}</w:t>
       </w:r>
       <w:r>
         <w:rPr>
@@ -14277,15 +12956,7 @@
         <w:jc w:val="both"/>
       </w:pPr>
       <w:r>
-        <w:t xml:space="preserve">U měřených osob nebyl překročen přípustný hygienický limit 30 % </w:t>
-      </w:r>
-      <w:proofErr w:type="spellStart"/>
-      <w:r>
-        <w:t>Fmax</w:t>
-      </w:r>
-      <w:proofErr w:type="spellEnd"/>
-      <w:r>
-        <w:t xml:space="preserve"> pro celosměnový časově vážený průměr svalových sil při převážně dynamické zátěži svalstva horních končetin.</w:t>
+        <w:t>U měřených osob nebyl překročen přípustný hygienický limit 30 % Fmax pro celosměnový časově vážený průměr svalových sil při převážně dynamické zátěži svalstva horních končetin.</w:t>
       </w:r>
     </w:p>
     <w:p>
@@ -14326,15 +12997,7 @@
         <w:t>ou</w:t>
       </w:r>
       <w:r>
-        <w:t xml:space="preserve"> a předloktí (55–70 % </w:t>
-      </w:r>
-      <w:proofErr w:type="spellStart"/>
-      <w:r>
-        <w:t>Fmax</w:t>
-      </w:r>
-      <w:proofErr w:type="spellEnd"/>
-      <w:r>
-        <w:t xml:space="preserve">). Celosměnový počet těchto sil </w:t>
+        <w:t xml:space="preserve"> a předloktí (55–70 % Fmax). Celosměnový počet těchto sil </w:t>
       </w:r>
       <w:r>
         <w:rPr>
@@ -14373,15 +13036,7 @@
         <w:jc w:val="both"/>
       </w:pPr>
       <w:r>
-        <w:t xml:space="preserve">Když poslední 4 hodnoty (nadlimitní síly nad </w:t>
-      </w:r>
-      <w:proofErr w:type="gramStart"/>
-      <w:r>
-        <w:t>70%</w:t>
-      </w:r>
-      <w:proofErr w:type="gramEnd"/>
-      <w:r>
-        <w:t>) ve sloupci jsou 0 0 0 0</w:t>
+        <w:t>Když poslední 4 hodnoty (nadlimitní síly nad 70%) ve sloupci jsou 0 0 0 0</w:t>
       </w:r>
     </w:p>
     <w:p>
@@ -14414,15 +13069,7 @@
         <w:jc w:val="both"/>
       </w:pPr>
       <w:r>
-        <w:t xml:space="preserve">Při provádění práce dochází k vynakládání nadlimitních svalových sil u měřených svalových skupin pravé ruky a předloktí (nad 70 % </w:t>
-      </w:r>
-      <w:proofErr w:type="spellStart"/>
-      <w:r>
-        <w:t>Fmax</w:t>
-      </w:r>
-      <w:proofErr w:type="spellEnd"/>
-      <w:r>
-        <w:t xml:space="preserve">). </w:t>
+        <w:t xml:space="preserve">Při provádění práce dochází k vynakládání nadlimitních svalových sil u měřených svalových skupin pravé ruky a předloktí (nad 70 % Fmax). </w:t>
       </w:r>
     </w:p>
     <w:p>
@@ -14450,15 +13097,7 @@
         <w:jc w:val="both"/>
       </w:pPr>
       <w:r>
-        <w:t xml:space="preserve">Při provádění práce dochází k vynakládání nadlimitních svalových sil u měřených svalových skupin levé ruky a předloktí (nad 70 % </w:t>
-      </w:r>
-      <w:proofErr w:type="spellStart"/>
-      <w:r>
-        <w:t>Fmax</w:t>
-      </w:r>
-      <w:proofErr w:type="spellEnd"/>
-      <w:r>
-        <w:t xml:space="preserve">). </w:t>
+        <w:t xml:space="preserve">Při provádění práce dochází k vynakládání nadlimitních svalových sil u měřených svalových skupin levé ruky a předloktí (nad 70 % Fmax). </w:t>
       </w:r>
     </w:p>
     <w:p>
@@ -14486,15 +13125,7 @@
         <w:jc w:val="both"/>
       </w:pPr>
       <w:r>
-        <w:t xml:space="preserve">Při provádění práce dochází k vynakládání nadlimitních svalových sil u měřených extenzorových svalových skupin rukou a předloktí (nad 70 % </w:t>
-      </w:r>
-      <w:proofErr w:type="spellStart"/>
-      <w:r>
-        <w:t>Fmax</w:t>
-      </w:r>
-      <w:proofErr w:type="spellEnd"/>
-      <w:r>
-        <w:t>).</w:t>
+        <w:t>Při provádění práce dochází k vynakládání nadlimitních svalových sil u měřených extenzorových svalových skupin rukou a předloktí (nad 70 % Fmax).</w:t>
       </w:r>
     </w:p>
     <w:p>
@@ -14522,15 +13153,7 @@
         <w:jc w:val="both"/>
       </w:pPr>
       <w:r>
-        <w:t xml:space="preserve">Při provádění práce dochází k vynakládání nadlimitních svalových sil u měřených flexorových svalových skupin rukou a předloktí (nad 70 % </w:t>
-      </w:r>
-      <w:proofErr w:type="spellStart"/>
-      <w:r>
-        <w:t>Fmax</w:t>
-      </w:r>
-      <w:proofErr w:type="spellEnd"/>
-      <w:r>
-        <w:t>).</w:t>
+        <w:t>Při provádění práce dochází k vynakládání nadlimitních svalových sil u měřených flexorových svalových skupin rukou a předloktí (nad 70 % Fmax).</w:t>
       </w:r>
     </w:p>
     <w:p>
@@ -14576,15 +13199,7 @@
         <w:jc w:val="both"/>
       </w:pPr>
       <w:r>
-        <w:t xml:space="preserve">Při provádění práce dochází k vynakládání nadlimitních svalových sil u flexorů PHK a extenzorů LHK (nad 70 % </w:t>
-      </w:r>
-      <w:proofErr w:type="spellStart"/>
-      <w:r>
-        <w:t>Fmax</w:t>
-      </w:r>
-      <w:proofErr w:type="spellEnd"/>
-      <w:r>
-        <w:t>).</w:t>
+        <w:t>Při provádění práce dochází k vynakládání nadlimitních svalových sil u flexorů PHK a extenzorů LHK (nad 70 % Fmax).</w:t>
       </w:r>
     </w:p>
     <w:p>
@@ -14656,26 +13271,10 @@
         </w:rPr>
       </w:pPr>
       <w:r>
-        <w:t>atp.</w:t>
-      </w:r>
-      <w:proofErr w:type="gramStart"/>
-      <w:r>
-        <w:t>}}</w:t>
-      </w:r>
-      <w:r>
-        <w:t>(</w:t>
-      </w:r>
-      <w:proofErr w:type="gramEnd"/>
-      <w:r>
-        <w:t xml:space="preserve">nad 70 % </w:t>
-      </w:r>
-      <w:proofErr w:type="spellStart"/>
-      <w:r>
-        <w:t>Fmax</w:t>
-      </w:r>
-      <w:proofErr w:type="spellEnd"/>
-      <w:r>
-        <w:t>).</w:t>
+        <w:t>atp.}}</w:t>
+      </w:r>
+      <w:r>
+        <w:t>(nad 70 % Fmax).</w:t>
       </w:r>
       <w:r>
         <w:t xml:space="preserve"> </w:t>
@@ -15137,15 +13736,7 @@
               <w:jc w:val="center"/>
             </w:pPr>
             <w:r>
-              <w:t>{{section2_</w:t>
-            </w:r>
-            <w:proofErr w:type="gramStart"/>
-            <w:r>
-              <w:t>firma.profession</w:t>
-            </w:r>
-            <w:proofErr w:type="gramEnd"/>
-            <w:r>
-              <w:t>_name}}</w:t>
+              <w:t>{{section2_firma.profession_name}}</w:t>
             </w:r>
           </w:p>
         </w:tc>
@@ -15166,15 +13757,7 @@
               <w:jc w:val="center"/>
             </w:pPr>
             <w:r>
-              <w:t xml:space="preserve">{{Zde stejná logika, jako když se porovnávala hodnota vůči té tabulce v excelu. Pokud překračuje, tak nad limitem. Pokud nepřekračuje, tak pod limitem text. Pokud je text „nad limitem“ tak </w:t>
-            </w:r>
-            <w:proofErr w:type="spellStart"/>
-            <w:r>
-              <w:t>aŤ</w:t>
-            </w:r>
-            <w:proofErr w:type="spellEnd"/>
-            <w:r>
-              <w:t xml:space="preserve"> je červený. Tuto logiku pro příslušené svalové skupiny i do dalších sloupců}}</w:t>
+              <w:t>{{Zde stejná logika, jako když se porovnávala hodnota vůči té tabulce v excelu. Pokud překračuje, tak nad limitem. Pokud nepřekračuje, tak pod limitem text. Pokud je text „nad limitem“ tak aŤ je červený. Tuto logiku pro příslušené svalové skupiny i do dalších sloupců}}</w:t>
             </w:r>
           </w:p>
         </w:tc>
@@ -15301,29 +13884,13 @@
         <w:t xml:space="preserve"> </w:t>
       </w:r>
       <w:r>
-        <w:t>{{section2_</w:t>
-      </w:r>
-      <w:proofErr w:type="gramStart"/>
-      <w:r>
-        <w:t>firma.workplace</w:t>
-      </w:r>
-      <w:proofErr w:type="gramEnd"/>
-      <w:r>
-        <w:t>}}</w:t>
+        <w:t>{{section2_firma.workplace}}</w:t>
       </w:r>
       <w:r>
         <w:t xml:space="preserve"> při vykonávání činnosti </w:t>
       </w:r>
       <w:r>
-        <w:t>{{section2_</w:t>
-      </w:r>
-      <w:proofErr w:type="gramStart"/>
-      <w:r>
-        <w:t>firma.profession</w:t>
-      </w:r>
-      <w:proofErr w:type="gramEnd"/>
-      <w:r>
-        <w:t>_name}}</w:t>
+        <w:t>{{section2_firma.profession_name}}</w:t>
       </w:r>
       <w:r>
         <w:t xml:space="preserve"> </w:t>
@@ -15401,13 +13968,8 @@
             </w:pPr>
             <w:bookmarkStart w:id="15" w:name="_Hlk163735604"/>
             <w:r>
-              <w:t xml:space="preserve">Celosměnový počet pohybů rukou a předloktí s ohledem na vynakládanou průměrnou směnovou časově váženou hodnotu % </w:t>
-            </w:r>
-            <w:proofErr w:type="spellStart"/>
-            <w:r>
-              <w:t>Fmax</w:t>
-            </w:r>
-            <w:proofErr w:type="spellEnd"/>
+              <w:t>Celosměnový počet pohybů rukou a předloktí s ohledem na vynakládanou průměrnou směnovou časově váženou hodnotu % Fmax</w:t>
+            </w:r>
           </w:p>
         </w:tc>
         <w:tc>
@@ -15615,11 +14177,9 @@
             <w:pPr>
               <w:spacing w:after="240"/>
             </w:pPr>
-            <w:proofErr w:type="spellStart"/>
             <w:r>
               <w:t>Fmax</w:t>
             </w:r>
-            <w:proofErr w:type="spellEnd"/>
           </w:p>
         </w:tc>
         <w:tc>
@@ -15657,13 +14217,8 @@
               <w:spacing w:after="240"/>
             </w:pPr>
             <w:r>
-              <w:t xml:space="preserve">% </w:t>
-            </w:r>
-            <w:proofErr w:type="spellStart"/>
-            <w:r>
-              <w:t>Fmax</w:t>
-            </w:r>
-            <w:proofErr w:type="spellEnd"/>
+              <w:t>% Fmax</w:t>
+            </w:r>
           </w:p>
         </w:tc>
         <w:tc>
@@ -15686,23 +14241,7 @@
               <w:jc w:val="both"/>
             </w:pPr>
             <w:r>
-              <w:t xml:space="preserve">procento maximální svalové síly – udává poměr vynaložené svalové síly k </w:t>
-            </w:r>
-            <w:proofErr w:type="spellStart"/>
-            <w:r>
-              <w:t>Fmax</w:t>
-            </w:r>
-            <w:proofErr w:type="spellEnd"/>
-            <w:r>
-              <w:t xml:space="preserve">, přičemž </w:t>
-            </w:r>
-            <w:proofErr w:type="spellStart"/>
-            <w:r>
-              <w:t>Fmax</w:t>
-            </w:r>
-            <w:proofErr w:type="spellEnd"/>
-            <w:r>
-              <w:t xml:space="preserve"> odpovídá 100 %</w:t>
+              <w:t>procento maximální svalové síly – udává poměr vynaložené svalové síly k Fmax, přičemž Fmax odpovídá 100 %</w:t>
             </w:r>
           </w:p>
         </w:tc>
@@ -16098,15 +14637,7 @@
               <w:jc w:val="both"/>
             </w:pPr>
             <w:r>
-              <w:t xml:space="preserve">časově vážený průměr svalových sil vynakládaných svalovou skupinou (% </w:t>
-            </w:r>
-            <w:proofErr w:type="spellStart"/>
-            <w:r>
-              <w:t>Fmax</w:t>
-            </w:r>
-            <w:proofErr w:type="spellEnd"/>
-            <w:r>
-              <w:t>)</w:t>
+              <w:t>časově vážený průměr svalových sil vynakládaných svalovou skupinou (% Fmax)</w:t>
             </w:r>
           </w:p>
         </w:tc>
@@ -16145,13 +14676,8 @@
               <w:jc w:val="both"/>
             </w:pPr>
             <w:r>
-              <w:t xml:space="preserve">svalové síly v rozmezí 55 až 70 % </w:t>
-            </w:r>
-            <w:proofErr w:type="spellStart"/>
-            <w:r>
-              <w:t>Fmax</w:t>
-            </w:r>
-            <w:proofErr w:type="spellEnd"/>
+              <w:t>svalové síly v rozmezí 55 až 70 % Fmax</w:t>
+            </w:r>
           </w:p>
         </w:tc>
       </w:tr>
@@ -16189,13 +14715,8 @@
               <w:jc w:val="both"/>
             </w:pPr>
             <w:r>
-              <w:t xml:space="preserve">svalové síly přesahující 70 % </w:t>
-            </w:r>
-            <w:proofErr w:type="spellStart"/>
-            <w:r>
-              <w:t>Fmax</w:t>
-            </w:r>
-            <w:proofErr w:type="spellEnd"/>
+              <w:t>svalové síly přesahující 70 % Fmax</w:t>
+            </w:r>
           </w:p>
         </w:tc>
       </w:tr>
@@ -16359,15 +14880,7 @@
         <w:t xml:space="preserve">Měření provedl: </w:t>
       </w:r>
       <w:r>
-        <w:t>{{section6_</w:t>
-      </w:r>
-      <w:proofErr w:type="gramStart"/>
-      <w:r>
-        <w:t>final.measured</w:t>
-      </w:r>
-      <w:proofErr w:type="gramEnd"/>
-      <w:r>
-        <w:t>_by}}</w:t>
+        <w:t>{{section6_final.measured_by}}</w:t>
       </w:r>
     </w:p>
     <w:p>
@@ -16383,15 +14896,7 @@
         <w:spacing w:before="800" w:line="276" w:lineRule="auto"/>
       </w:pPr>
       <w:r>
-        <w:t xml:space="preserve">Protokol vypracoval: MUDr. Danica </w:t>
-      </w:r>
-      <w:proofErr w:type="spellStart"/>
-      <w:r>
-        <w:t>Henčeková</w:t>
-      </w:r>
-      <w:proofErr w:type="spellEnd"/>
-      <w:r>
-        <w:t xml:space="preserve">, Ph.D., </w:t>
+        <w:t xml:space="preserve">Protokol vypracoval: MUDr. Danica Henčeková, Ph.D., </w:t>
       </w:r>
     </w:p>
     <w:p>
@@ -16416,15 +14921,7 @@
         <w:spacing w:line="276" w:lineRule="auto"/>
       </w:pPr>
       <w:r>
-        <w:t xml:space="preserve">Za správnost odpovídá a schválil vedoucí autorizované laboratoře: MUDr. Danica </w:t>
-      </w:r>
-      <w:proofErr w:type="spellStart"/>
-      <w:r>
-        <w:t>Henčeková</w:t>
-      </w:r>
-      <w:proofErr w:type="spellEnd"/>
-      <w:r>
-        <w:t>, Ph.D.</w:t>
+        <w:t>Za správnost odpovídá a schválil vedoucí autorizované laboratoře: MUDr. Danica Henčeková, Ph.D.</w:t>
       </w:r>
     </w:p>
     <w:p>
@@ -16433,6 +14930,7 @@
       </w:pPr>
       <w:r>
         <w:rPr>
+          <w:noProof/>
           <w:highlight w:val="yellow"/>
         </w:rPr>
         <w:drawing>
@@ -16546,13 +15044,8 @@
       <w:bookmarkEnd w:id="17"/>
       <w:r>
         <w:lastRenderedPageBreak/>
-        <w:t xml:space="preserve">Příloha k autorizovanému protokolu č. LSZ XX/202X: výstup z programu EMG </w:t>
-      </w:r>
-      <w:proofErr w:type="spellStart"/>
-      <w:r>
-        <w:t>Analyzer</w:t>
-      </w:r>
-      <w:proofErr w:type="spellEnd"/>
+        <w:t>Příloha k autorizovanému protokolu č. LSZ XX/202X: výstup z programu EMG Analyzer</w:t>
+      </w:r>
     </w:p>
     <w:bookmarkEnd w:id="18"/>
     <w:p>
@@ -16578,21 +15071,7 @@
         <w:rPr>
           <w:highlight w:val="yellow"/>
         </w:rPr>
-        <w:t>{{section2_</w:t>
-      </w:r>
-      <w:proofErr w:type="gramStart"/>
-      <w:r>
-        <w:rPr>
-          <w:highlight w:val="yellow"/>
-        </w:rPr>
-        <w:t>firma.profession</w:t>
-      </w:r>
-      <w:proofErr w:type="gramEnd"/>
-      <w:r>
-        <w:rPr>
-          <w:highlight w:val="yellow"/>
-        </w:rPr>
-        <w:t>_name}}</w:t>
+        <w:t>{{section2_firma.profession_name}}</w:t>
       </w:r>
       <w:r>
         <w:rPr>
@@ -16604,21 +15083,7 @@
         <w:rPr>
           <w:highlight w:val="yellow"/>
         </w:rPr>
-        <w:t>{{section2_</w:t>
-      </w:r>
-      <w:proofErr w:type="gramStart"/>
-      <w:r>
-        <w:rPr>
-          <w:highlight w:val="yellow"/>
-        </w:rPr>
-        <w:t>firma.workplace</w:t>
-      </w:r>
-      <w:proofErr w:type="gramEnd"/>
-      <w:r>
-        <w:rPr>
-          <w:highlight w:val="yellow"/>
-        </w:rPr>
-        <w:t>}}</w:t>
+        <w:t>{{section2_firma.workplace}}</w:t>
       </w:r>
       <w:r>
         <w:t xml:space="preserve"> </w:t>
@@ -16672,15 +15137,7 @@
         <w:adjustRightInd w:val="0"/>
       </w:pPr>
       <w:r>
-        <w:t xml:space="preserve"> EMG_1    </w:t>
-      </w:r>
-      <w:proofErr w:type="spellStart"/>
-      <w:r>
-        <w:t>Fmax</w:t>
-      </w:r>
-      <w:proofErr w:type="spellEnd"/>
-      <w:r>
-        <w:t xml:space="preserve"> =199,000</w:t>
+        <w:t xml:space="preserve"> EMG_1    Fmax =199,000</w:t>
       </w:r>
     </w:p>
     <w:p>
@@ -16690,15 +15147,7 @@
         <w:adjustRightInd w:val="0"/>
       </w:pPr>
       <w:r>
-        <w:t xml:space="preserve"> EMG_2    </w:t>
-      </w:r>
-      <w:proofErr w:type="spellStart"/>
-      <w:r>
-        <w:t>Fmax</w:t>
-      </w:r>
-      <w:proofErr w:type="spellEnd"/>
-      <w:r>
-        <w:t xml:space="preserve"> =171,000</w:t>
+        <w:t xml:space="preserve"> EMG_2    Fmax =171,000</w:t>
       </w:r>
     </w:p>
     <w:p>
@@ -16708,15 +15157,7 @@
         <w:adjustRightInd w:val="0"/>
       </w:pPr>
       <w:r>
-        <w:t xml:space="preserve"> EMG_3    </w:t>
-      </w:r>
-      <w:proofErr w:type="spellStart"/>
-      <w:r>
-        <w:t>Fmax</w:t>
-      </w:r>
-      <w:proofErr w:type="spellEnd"/>
-      <w:r>
-        <w:t xml:space="preserve"> =138,000</w:t>
+        <w:t xml:space="preserve"> EMG_3    Fmax =138,000</w:t>
       </w:r>
     </w:p>
     <w:p>
@@ -16726,27 +15167,14 @@
         <w:adjustRightInd w:val="0"/>
       </w:pPr>
       <w:r>
-        <w:t xml:space="preserve"> EMG_4    </w:t>
-      </w:r>
-      <w:proofErr w:type="spellStart"/>
-      <w:r>
-        <w:t>Fmax</w:t>
-      </w:r>
-      <w:proofErr w:type="spellEnd"/>
+        <w:t xml:space="preserve"> EMG_4    Fmax = </w:t>
+      </w:r>
       <w:r>
         <w:t xml:space="preserve"> </w:t>
       </w:r>
-      <w:proofErr w:type="gramStart"/>
-      <w:r>
-        <w:t xml:space="preserve">= </w:t>
-      </w:r>
-      <w:r>
-        <w:t xml:space="preserve"> </w:t>
-      </w:r>
       <w:r>
         <w:t>98,000</w:t>
       </w:r>
-      <w:proofErr w:type="gramEnd"/>
     </w:p>
     <w:p>
       <w:pPr>
@@ -16779,52 +15207,7 @@
         <w:adjustRightInd w:val="0"/>
       </w:pPr>
       <w:r>
-        <w:t xml:space="preserve">      % hodnoty </w:t>
-      </w:r>
-      <w:proofErr w:type="spellStart"/>
-      <w:proofErr w:type="gramStart"/>
-      <w:r>
-        <w:t>Fmax</w:t>
-      </w:r>
-      <w:proofErr w:type="spellEnd"/>
-      <w:r>
-        <w:t xml:space="preserve">:   </w:t>
-      </w:r>
-      <w:proofErr w:type="gramEnd"/>
-      <w:r>
-        <w:t xml:space="preserve">        EMG_</w:t>
-      </w:r>
-      <w:proofErr w:type="gramStart"/>
-      <w:r>
-        <w:t>1 :</w:t>
-      </w:r>
-      <w:proofErr w:type="gramEnd"/>
-      <w:r>
-        <w:t xml:space="preserve">    8,57           EMG_</w:t>
-      </w:r>
-      <w:proofErr w:type="gramStart"/>
-      <w:r>
-        <w:t>2 :</w:t>
-      </w:r>
-      <w:proofErr w:type="gramEnd"/>
-      <w:r>
-        <w:t xml:space="preserve">   10,09           EMG_</w:t>
-      </w:r>
-      <w:proofErr w:type="gramStart"/>
-      <w:r>
-        <w:t>3 :</w:t>
-      </w:r>
-      <w:proofErr w:type="gramEnd"/>
-      <w:r>
-        <w:t xml:space="preserve">    9,10           EMG_</w:t>
-      </w:r>
-      <w:proofErr w:type="gramStart"/>
-      <w:r>
-        <w:t>4 :</w:t>
-      </w:r>
-      <w:proofErr w:type="gramEnd"/>
-      <w:r>
-        <w:t xml:space="preserve">    8,21          </w:t>
+        <w:t xml:space="preserve">      % hodnoty Fmax:           EMG_1 :    8,57           EMG_2 :   10,09           EMG_3 :    9,10           EMG_4 :    8,21          </w:t>
       </w:r>
     </w:p>
     <w:p>
@@ -16891,91 +15274,13 @@
         <w:rPr>
           <w:highlight w:val="yellow"/>
         </w:rPr>
-        <w:t xml:space="preserve">      % hodnoty </w:t>
-      </w:r>
-      <w:proofErr w:type="spellStart"/>
-      <w:proofErr w:type="gramStart"/>
+        <w:t xml:space="preserve">      % hodnoty Fmax:     </w:t>
+      </w:r>
       <w:r>
         <w:rPr>
           <w:highlight w:val="yellow"/>
         </w:rPr>
-        <w:t>Fmax</w:t>
-      </w:r>
-      <w:proofErr w:type="spellEnd"/>
-      <w:r>
-        <w:rPr>
-          <w:highlight w:val="yellow"/>
-        </w:rPr>
-        <w:t xml:space="preserve">:   </w:t>
-      </w:r>
-      <w:proofErr w:type="gramEnd"/>
-      <w:r>
-        <w:rPr>
-          <w:highlight w:val="yellow"/>
-        </w:rPr>
-        <w:t xml:space="preserve">  </w:t>
-      </w:r>
-      <w:r>
-        <w:rPr>
-          <w:highlight w:val="yellow"/>
-        </w:rPr>
-        <w:t xml:space="preserve">      EMG_</w:t>
-      </w:r>
-      <w:proofErr w:type="gramStart"/>
-      <w:r>
-        <w:rPr>
-          <w:highlight w:val="yellow"/>
-        </w:rPr>
-        <w:t>1 :</w:t>
-      </w:r>
-      <w:proofErr w:type="gramEnd"/>
-      <w:r>
-        <w:rPr>
-          <w:highlight w:val="yellow"/>
-        </w:rPr>
-        <w:t xml:space="preserve">    8,10           EMG_</w:t>
-      </w:r>
-      <w:proofErr w:type="gramStart"/>
-      <w:r>
-        <w:rPr>
-          <w:highlight w:val="yellow"/>
-        </w:rPr>
-        <w:t>2 :</w:t>
-      </w:r>
-      <w:proofErr w:type="gramEnd"/>
-      <w:r>
-        <w:rPr>
-          <w:highlight w:val="yellow"/>
-        </w:rPr>
-        <w:t xml:space="preserve">    9,40           EMG_</w:t>
-      </w:r>
-      <w:proofErr w:type="gramStart"/>
-      <w:r>
-        <w:rPr>
-          <w:highlight w:val="yellow"/>
-        </w:rPr>
-        <w:t>3 :</w:t>
-      </w:r>
-      <w:proofErr w:type="gramEnd"/>
-      <w:r>
-        <w:rPr>
-          <w:highlight w:val="yellow"/>
-        </w:rPr>
-        <w:t xml:space="preserve">    8,60           EMG_</w:t>
-      </w:r>
-      <w:proofErr w:type="gramStart"/>
-      <w:r>
-        <w:rPr>
-          <w:highlight w:val="yellow"/>
-        </w:rPr>
-        <w:t>4 :</w:t>
-      </w:r>
-      <w:proofErr w:type="gramEnd"/>
-      <w:r>
-        <w:rPr>
-          <w:highlight w:val="yellow"/>
-        </w:rPr>
-        <w:t xml:space="preserve">    7,80</w:t>
+        <w:t xml:space="preserve">      EMG_1 :    8,10           EMG_2 :    9,40           EMG_3 :    8,60           EMG_4 :    7,80</w:t>
       </w:r>
       <w:r>
         <w:t xml:space="preserve"> </w:t>
@@ -17032,6 +15337,9 @@
         <w:jc w:val="left"/>
       </w:pPr>
       <w:r>
+        <w:rPr>
+          <w:noProof/>
+        </w:rPr>
         <w:drawing>
           <wp:inline distT="0" distB="0" distL="0" distR="0" wp14:anchorId="5CE26983" wp14:editId="64FB5A21">
             <wp:extent cx="3525500" cy="3780000"/>
@@ -17118,13 +15426,8 @@
       </w:r>
       <w:r>
         <w:lastRenderedPageBreak/>
-        <w:t xml:space="preserve">Příloha k autorizovanému protokolu č. LSZ XX/202X: výstup z programu EMG </w:t>
-      </w:r>
-      <w:proofErr w:type="spellStart"/>
-      <w:r>
-        <w:t>Analyzer</w:t>
-      </w:r>
-      <w:proofErr w:type="spellEnd"/>
+        <w:t>Příloha k autorizovanému protokolu č. LSZ XX/202X: výstup z programu EMG Analyzer</w:t>
+      </w:r>
     </w:p>
     <w:p>
       <w:pPr>
@@ -17152,21 +15455,7 @@
         <w:rPr>
           <w:highlight w:val="yellow"/>
         </w:rPr>
-        <w:t>{{section2_</w:t>
-      </w:r>
-      <w:proofErr w:type="gramStart"/>
-      <w:r>
-        <w:rPr>
-          <w:highlight w:val="yellow"/>
-        </w:rPr>
-        <w:t>firma.profession</w:t>
-      </w:r>
-      <w:proofErr w:type="gramEnd"/>
-      <w:r>
-        <w:rPr>
-          <w:highlight w:val="yellow"/>
-        </w:rPr>
-        <w:t>_name}}</w:t>
+        <w:t>{{section2_firma.profession_name}}</w:t>
       </w:r>
       <w:r>
         <w:rPr>
@@ -17178,21 +15467,7 @@
         <w:rPr>
           <w:highlight w:val="yellow"/>
         </w:rPr>
-        <w:t>{{section2_</w:t>
-      </w:r>
-      <w:proofErr w:type="gramStart"/>
-      <w:r>
-        <w:rPr>
-          <w:highlight w:val="yellow"/>
-        </w:rPr>
-        <w:t>firma.workplace</w:t>
-      </w:r>
-      <w:proofErr w:type="gramEnd"/>
-      <w:r>
-        <w:rPr>
-          <w:highlight w:val="yellow"/>
-        </w:rPr>
-        <w:t>}}</w:t>
+        <w:t>{{section2_firma.workplace}}</w:t>
       </w:r>
       <w:r>
         <w:t xml:space="preserve"> </w:t>
@@ -17246,15 +15521,7 @@
         <w:adjustRightInd w:val="0"/>
       </w:pPr>
       <w:r>
-        <w:t xml:space="preserve"> EMG_1    </w:t>
-      </w:r>
-      <w:proofErr w:type="spellStart"/>
-      <w:r>
-        <w:t>Fmax</w:t>
-      </w:r>
-      <w:proofErr w:type="spellEnd"/>
-      <w:r>
-        <w:t xml:space="preserve"> =136,500</w:t>
+        <w:t xml:space="preserve"> EMG_1    Fmax =136,500</w:t>
       </w:r>
     </w:p>
     <w:p>
@@ -17264,15 +15531,7 @@
         <w:adjustRightInd w:val="0"/>
       </w:pPr>
       <w:r>
-        <w:t xml:space="preserve"> EMG_2    </w:t>
-      </w:r>
-      <w:proofErr w:type="spellStart"/>
-      <w:r>
-        <w:t>Fmax</w:t>
-      </w:r>
-      <w:proofErr w:type="spellEnd"/>
-      <w:r>
-        <w:t xml:space="preserve"> =133,000</w:t>
+        <w:t xml:space="preserve"> EMG_2    Fmax =133,000</w:t>
       </w:r>
     </w:p>
     <w:p>
@@ -17282,15 +15541,7 @@
         <w:adjustRightInd w:val="0"/>
       </w:pPr>
       <w:r>
-        <w:t xml:space="preserve"> EMG_3    </w:t>
-      </w:r>
-      <w:proofErr w:type="spellStart"/>
-      <w:r>
-        <w:t>Fmax</w:t>
-      </w:r>
-      <w:proofErr w:type="spellEnd"/>
-      <w:r>
-        <w:t xml:space="preserve"> =184,500</w:t>
+        <w:t xml:space="preserve"> EMG_3    Fmax =184,500</w:t>
       </w:r>
     </w:p>
     <w:p>
@@ -17300,15 +15551,7 @@
         <w:adjustRightInd w:val="0"/>
       </w:pPr>
       <w:r>
-        <w:t xml:space="preserve"> EMG_4    </w:t>
-      </w:r>
-      <w:proofErr w:type="spellStart"/>
-      <w:r>
-        <w:t>Fmax</w:t>
-      </w:r>
-      <w:proofErr w:type="spellEnd"/>
-      <w:r>
-        <w:t xml:space="preserve"> =138,000</w:t>
+        <w:t xml:space="preserve"> EMG_4    Fmax =138,000</w:t>
       </w:r>
     </w:p>
     <w:p>
@@ -17349,52 +15592,7 @@
         <w:adjustRightInd w:val="0"/>
       </w:pPr>
       <w:r>
-        <w:t xml:space="preserve">      % hodnoty </w:t>
-      </w:r>
-      <w:proofErr w:type="spellStart"/>
-      <w:proofErr w:type="gramStart"/>
-      <w:r>
-        <w:t>Fmax</w:t>
-      </w:r>
-      <w:proofErr w:type="spellEnd"/>
-      <w:r>
-        <w:t xml:space="preserve">:   </w:t>
-      </w:r>
-      <w:proofErr w:type="gramEnd"/>
-      <w:r>
-        <w:t xml:space="preserve">        EMG_</w:t>
-      </w:r>
-      <w:proofErr w:type="gramStart"/>
-      <w:r>
-        <w:t>1 :</w:t>
-      </w:r>
-      <w:proofErr w:type="gramEnd"/>
-      <w:r>
-        <w:t xml:space="preserve">    8,72           EMG_</w:t>
-      </w:r>
-      <w:proofErr w:type="gramStart"/>
-      <w:r>
-        <w:t>2 :</w:t>
-      </w:r>
-      <w:proofErr w:type="gramEnd"/>
-      <w:r>
-        <w:t xml:space="preserve">   10,10           EMG_</w:t>
-      </w:r>
-      <w:proofErr w:type="gramStart"/>
-      <w:r>
-        <w:t>3 :</w:t>
-      </w:r>
-      <w:proofErr w:type="gramEnd"/>
-      <w:r>
-        <w:t xml:space="preserve">    8,13           EMG_</w:t>
-      </w:r>
-      <w:proofErr w:type="gramStart"/>
-      <w:r>
-        <w:t>4 :</w:t>
-      </w:r>
-      <w:proofErr w:type="gramEnd"/>
-      <w:r>
-        <w:t xml:space="preserve">    9,51          </w:t>
+        <w:t xml:space="preserve">      % hodnoty Fmax:           EMG_1 :    8,72           EMG_2 :   10,10           EMG_3 :    8,13           EMG_4 :    9,51          </w:t>
       </w:r>
     </w:p>
     <w:p>
@@ -17449,85 +15647,7 @@
         <w:rPr>
           <w:highlight w:val="yellow"/>
         </w:rPr>
-        <w:t xml:space="preserve">      % hodnoty </w:t>
-      </w:r>
-      <w:proofErr w:type="spellStart"/>
-      <w:proofErr w:type="gramStart"/>
-      <w:r>
-        <w:rPr>
-          <w:highlight w:val="yellow"/>
-        </w:rPr>
-        <w:t>Fmax</w:t>
-      </w:r>
-      <w:proofErr w:type="spellEnd"/>
-      <w:r>
-        <w:rPr>
-          <w:highlight w:val="yellow"/>
-        </w:rPr>
-        <w:t xml:space="preserve">:   </w:t>
-      </w:r>
-      <w:proofErr w:type="gramEnd"/>
-      <w:r>
-        <w:rPr>
-          <w:highlight w:val="yellow"/>
-        </w:rPr>
-        <w:t xml:space="preserve">        EMG_</w:t>
-      </w:r>
-      <w:proofErr w:type="gramStart"/>
-      <w:r>
-        <w:rPr>
-          <w:highlight w:val="yellow"/>
-        </w:rPr>
-        <w:t>1 :</w:t>
-      </w:r>
-      <w:proofErr w:type="gramEnd"/>
-      <w:r>
-        <w:rPr>
-          <w:highlight w:val="yellow"/>
-        </w:rPr>
-        <w:t xml:space="preserve">    8,20           EMG_</w:t>
-      </w:r>
-      <w:proofErr w:type="gramStart"/>
-      <w:r>
-        <w:rPr>
-          <w:highlight w:val="yellow"/>
-        </w:rPr>
-        <w:t>2 :</w:t>
-      </w:r>
-      <w:proofErr w:type="gramEnd"/>
-      <w:r>
-        <w:rPr>
-          <w:highlight w:val="yellow"/>
-        </w:rPr>
-        <w:t xml:space="preserve">    9,40           EMG_</w:t>
-      </w:r>
-      <w:proofErr w:type="gramStart"/>
-      <w:r>
-        <w:rPr>
-          <w:highlight w:val="yellow"/>
-        </w:rPr>
-        <w:t>3 :</w:t>
-      </w:r>
-      <w:proofErr w:type="gramEnd"/>
-      <w:r>
-        <w:rPr>
-          <w:highlight w:val="yellow"/>
-        </w:rPr>
-        <w:t xml:space="preserve">    7,70           EMG_</w:t>
-      </w:r>
-      <w:proofErr w:type="gramStart"/>
-      <w:r>
-        <w:rPr>
-          <w:highlight w:val="yellow"/>
-        </w:rPr>
-        <w:t>4 :</w:t>
-      </w:r>
-      <w:proofErr w:type="gramEnd"/>
-      <w:r>
-        <w:rPr>
-          <w:highlight w:val="yellow"/>
-        </w:rPr>
-        <w:t xml:space="preserve">    8,90</w:t>
+        <w:t xml:space="preserve">      % hodnoty Fmax:           EMG_1 :    8,20           EMG_2 :    9,40           EMG_3 :    7,70           EMG_4 :    8,90</w:t>
       </w:r>
     </w:p>
     <w:p>
@@ -17602,6 +15722,9 @@
     </w:p>
     <w:p>
       <w:r>
+        <w:rPr>
+          <w:noProof/>
+        </w:rPr>
         <w:drawing>
           <wp:inline distT="0" distB="0" distL="0" distR="0" wp14:anchorId="058BC720" wp14:editId="3623389B">
             <wp:extent cx="3562738" cy="3779520"/>
@@ -17864,25 +15987,7 @@
               <w:sz w:val="18"/>
               <w:szCs w:val="18"/>
             </w:rPr>
-            <w:t xml:space="preserve">MUDr. Danica </w:t>
-          </w:r>
-          <w:proofErr w:type="spellStart"/>
-          <w:r>
-            <w:rPr>
-              <w:rFonts w:cstheme="minorHAnsi"/>
-              <w:sz w:val="18"/>
-              <w:szCs w:val="18"/>
-            </w:rPr>
-            <w:t>Henčeková</w:t>
-          </w:r>
-          <w:proofErr w:type="spellEnd"/>
-          <w:r>
-            <w:rPr>
-              <w:rFonts w:cstheme="minorHAnsi"/>
-              <w:sz w:val="18"/>
-              <w:szCs w:val="18"/>
-            </w:rPr>
-            <w:t>, Ph.D.</w:t>
+            <w:t>MUDr. Danica Henčeková, Ph.D.</w:t>
           </w:r>
         </w:p>
       </w:tc>
@@ -18166,25 +16271,7 @@
               <w:sz w:val="18"/>
               <w:szCs w:val="18"/>
             </w:rPr>
-            <w:t xml:space="preserve">MUDr. Danica </w:t>
-          </w:r>
-          <w:proofErr w:type="spellStart"/>
-          <w:r>
-            <w:rPr>
-              <w:rFonts w:cstheme="minorHAnsi"/>
-              <w:sz w:val="18"/>
-              <w:szCs w:val="18"/>
-            </w:rPr>
-            <w:t>Henčeková</w:t>
-          </w:r>
-          <w:proofErr w:type="spellEnd"/>
-          <w:r>
-            <w:rPr>
-              <w:rFonts w:cstheme="minorHAnsi"/>
-              <w:sz w:val="18"/>
-              <w:szCs w:val="18"/>
-            </w:rPr>
-            <w:t>, Ph.D.</w:t>
+            <w:t>MUDr. Danica Henčeková, Ph.D.</w:t>
           </w:r>
         </w:p>
       </w:tc>
@@ -18585,7 +16672,7 @@
         </mc:Choice>
         <mc:Fallback>
           <w:pict>
-            <v:line w14:anchorId="46E7A348" id="Přímá spojnice 3" o:spid="_x0000_s1026" style="position:absolute;z-index:251659264;visibility:visible;mso-wrap-style:square;mso-width-percent:0;mso-height-percent:0;mso-wrap-distance-left:9pt;mso-wrap-distance-top:0;mso-wrap-distance-right:9pt;mso-wrap-distance-bottom:0;mso-position-horizontal:absolute;mso-position-horizontal-relative:text;mso-position-vertical:absolute;mso-position-vertical-relative:text;mso-width-percent:0;mso-height-percent:0;mso-width-relative:margin;mso-height-relative:margin" from="-15.75pt,20pt" to="482.6pt,20pt" o:gfxdata="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" strokecolor="black [3040]"/>
+            <v:line w14:anchorId="600F835F" id="Přímá spojnice 3" o:spid="_x0000_s1026" style="position:absolute;z-index:251659264;visibility:visible;mso-wrap-style:square;mso-width-percent:0;mso-height-percent:0;mso-wrap-distance-left:9pt;mso-wrap-distance-top:0;mso-wrap-distance-right:9pt;mso-wrap-distance-bottom:0;mso-position-horizontal:absolute;mso-position-horizontal-relative:text;mso-position-vertical:absolute;mso-position-vertical-relative:text;mso-width-percent:0;mso-height-percent:0;mso-width-relative:margin;mso-height-relative:margin" from="-15.75pt,20pt" to="482.6pt,20pt" o:gfxdata="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" strokecolor="black [3040]"/>
           </w:pict>
         </mc:Fallback>
       </mc:AlternateContent>
@@ -21352,6 +19439,7 @@
   <w:style w:type="character" w:default="1" w:styleId="Standardnpsmoodstavce">
     <w:name w:val="Default Paragraph Font"/>
     <w:uiPriority w:val="1"/>
+    <w:semiHidden/>
     <w:unhideWhenUsed/>
   </w:style>
   <w:style w:type="table" w:default="1" w:styleId="Normlntabulka">

</xml_diff>